<commit_message>
feat: align website with Le Pacte budget and add Phase 3 citizen section
</commit_message>
<xml_diff>
--- a/Nice/Le_Pacte_Nice_IA.docx
+++ b/Nice/Le_Pacte_Nice_IA.docx
@@ -46,7 +46,7 @@
     </w:p>
     <w:p>
       <w:pPr>
-        <w:spacing w:before="0" w:after="400"/>
+        <w:spacing w:before="0" w:after="320"/>
       </w:pPr>
       <w:r>
         <w:rPr>
@@ -71,7 +71,7 @@
           <w:color w:val="0F172A"/>
           <w:sz w:val="30"/>
         </w:rPr>
-        <w:t>SOMMAIRE &amp; INDEX DU DOCUMENT</w:t>
+        <w:t>Index</w:t>
       </w:r>
     </w:p>
     <w:tbl>
@@ -81,25 +81,65 @@
         <w:tblLook w:firstColumn="1" w:firstRow="1" w:lastColumn="0" w:lastRow="0" w:noHBand="0" w:noVBand="1" w:val="04A0"/>
       </w:tblPr>
       <w:tblGrid>
-        <w:gridCol w:w="4824"/>
-        <w:gridCol w:w="4824"/>
+        <w:gridCol w:w="4896"/>
+        <w:gridCol w:w="4896"/>
       </w:tblGrid>
       <w:tr>
         <w:tc>
           <w:tcPr>
-            <w:tcW w:type="dxa" w:w="4824"/>
-            <w:shd w:fill="FFFFFF"/>
+            <w:tcW w:type="dxa" w:w="4896"/>
           </w:tcPr>
           <w:p>
             <w:pPr>
-              <w:spacing w:before="40" w:after="40"/>
+              <w:spacing w:before="30" w:after="30"/>
             </w:pPr>
             <w:r>
               <w:rPr>
                 <w:rFonts w:ascii="Arial" w:hAnsi="Arial"/>
                 <w:b/>
                 <w:color w:val="0F172A"/>
-                <w:sz w:val="19"/>
+                <w:sz w:val="18"/>
+              </w:rPr>
+              <w:t>Index</w:t>
+            </w:r>
+          </w:p>
+        </w:tc>
+        <w:tc>
+          <w:tcPr>
+            <w:tcW w:type="dxa" w:w="4896"/>
+          </w:tcPr>
+          <w:p>
+            <w:pPr>
+              <w:spacing w:before="30" w:after="30"/>
+              <w:jc w:val="right"/>
+            </w:pPr>
+            <w:r>
+              <w:rPr>
+                <w:rFonts w:ascii="Arial" w:hAnsi="Arial"/>
+                <w:b/>
+                <w:color w:val="0F172A"/>
+                <w:sz w:val="18"/>
+              </w:rPr>
+              <w:t>1</w:t>
+            </w:r>
+          </w:p>
+        </w:tc>
+      </w:tr>
+      <w:tr>
+        <w:tc>
+          <w:tcPr>
+            <w:tcW w:type="dxa" w:w="4896"/>
+          </w:tcPr>
+          <w:p>
+            <w:pPr>
+              <w:spacing w:before="30" w:after="30"/>
+            </w:pPr>
+            <w:r>
+              <w:rPr>
+                <w:rFonts w:ascii="Georgia" w:hAnsi="Georgia"/>
+                <w:b/>
+                <w:color w:val="0F172A"/>
+                <w:sz w:val="18"/>
               </w:rPr>
               <w:t>Résumé Exécutif &amp; Chiffrage Consolidé pour M. le Maire</w:t>
             </w:r>
@@ -107,22 +147,21 @@
         </w:tc>
         <w:tc>
           <w:tcPr>
-            <w:tcW w:type="dxa" w:w="4824"/>
-            <w:shd w:fill="FFFFFF"/>
+            <w:tcW w:type="dxa" w:w="4896"/>
           </w:tcPr>
           <w:p>
             <w:pPr>
-              <w:spacing w:before="40" w:after="40"/>
+              <w:spacing w:before="30" w:after="30"/>
               <w:jc w:val="right"/>
             </w:pPr>
             <w:r>
               <w:rPr>
                 <w:rFonts w:ascii="Arial" w:hAnsi="Arial"/>
-                <w:i/>
-                <w:color w:val="64748B"/>
+                <w:b/>
+                <w:color w:val="0F172A"/>
                 <w:sz w:val="18"/>
               </w:rPr>
-              <w:t>Page 2</w:t>
+              <w:t>1</w:t>
             </w:r>
           </w:p>
         </w:tc>
@@ -130,19 +169,18 @@
       <w:tr>
         <w:tc>
           <w:tcPr>
-            <w:tcW w:type="dxa" w:w="4824"/>
-            <w:shd w:fill="F8FAFC"/>
+            <w:tcW w:type="dxa" w:w="4896"/>
           </w:tcPr>
           <w:p>
             <w:pPr>
-              <w:spacing w:before="40" w:after="40"/>
+              <w:spacing w:before="30" w:after="30"/>
             </w:pPr>
             <w:r>
               <w:rPr>
-                <w:rFonts w:ascii="Arial" w:hAnsi="Arial"/>
+                <w:rFonts w:ascii="Georgia" w:hAnsi="Georgia"/>
                 <w:b/>
                 <w:color w:val="0F172A"/>
-                <w:sz w:val="19"/>
+                <w:sz w:val="18"/>
               </w:rPr>
               <w:t>1. Diagnostic Territorial &amp; Opportunités Européennes</w:t>
             </w:r>
@@ -150,22 +188,21 @@
         </w:tc>
         <w:tc>
           <w:tcPr>
-            <w:tcW w:type="dxa" w:w="4824"/>
-            <w:shd w:fill="F8FAFC"/>
+            <w:tcW w:type="dxa" w:w="4896"/>
           </w:tcPr>
           <w:p>
             <w:pPr>
-              <w:spacing w:before="40" w:after="40"/>
+              <w:spacing w:before="30" w:after="30"/>
               <w:jc w:val="right"/>
             </w:pPr>
             <w:r>
               <w:rPr>
                 <w:rFonts w:ascii="Arial" w:hAnsi="Arial"/>
-                <w:i/>
-                <w:color w:val="64748B"/>
+                <w:b/>
+                <w:color w:val="0F172A"/>
                 <w:sz w:val="18"/>
               </w:rPr>
-              <w:t>Page 3</w:t>
+              <w:t>2</w:t>
             </w:r>
           </w:p>
         </w:tc>
@@ -173,42 +210,40 @@
       <w:tr>
         <w:tc>
           <w:tcPr>
-            <w:tcW w:type="dxa" w:w="4824"/>
-            <w:shd w:fill="FFFFFF"/>
+            <w:tcW w:type="dxa" w:w="4896"/>
           </w:tcPr>
           <w:p>
             <w:pPr>
-              <w:spacing w:before="40" w:after="40"/>
+              <w:spacing w:before="30" w:after="30"/>
+            </w:pPr>
+            <w:r>
+              <w:rPr>
+                <w:rFonts w:ascii="Georgia" w:hAnsi="Georgia"/>
+                <w:b/>
+                <w:color w:val="0F172A"/>
+                <w:sz w:val="18"/>
+              </w:rPr>
+              <w:t>1.1 Alignement Institutionnel &amp; Leadership</w:t>
+            </w:r>
+          </w:p>
+        </w:tc>
+        <w:tc>
+          <w:tcPr>
+            <w:tcW w:type="dxa" w:w="4896"/>
+          </w:tcPr>
+          <w:p>
+            <w:pPr>
+              <w:spacing w:before="30" w:after="30"/>
+              <w:jc w:val="right"/>
             </w:pPr>
             <w:r>
               <w:rPr>
                 <w:rFonts w:ascii="Arial" w:hAnsi="Arial"/>
                 <w:b/>
                 <w:color w:val="0F172A"/>
-                <w:sz w:val="19"/>
-              </w:rPr>
-              <w:t xml:space="preserve">   1.1 Alignement Institutionnel &amp; Leadership Métropolitain</w:t>
-            </w:r>
-          </w:p>
-        </w:tc>
-        <w:tc>
-          <w:tcPr>
-            <w:tcW w:type="dxa" w:w="4824"/>
-            <w:shd w:fill="FFFFFF"/>
-          </w:tcPr>
-          <w:p>
-            <w:pPr>
-              <w:spacing w:before="40" w:after="40"/>
-              <w:jc w:val="right"/>
-            </w:pPr>
-            <w:r>
-              <w:rPr>
-                <w:rFonts w:ascii="Arial" w:hAnsi="Arial"/>
-                <w:i/>
-                <w:color w:val="64748B"/>
                 <w:sz w:val="18"/>
               </w:rPr>
-              <w:t>Page 3</w:t>
+              <w:t>2</w:t>
             </w:r>
           </w:p>
         </w:tc>
@@ -216,42 +251,40 @@
       <w:tr>
         <w:tc>
           <w:tcPr>
-            <w:tcW w:type="dxa" w:w="4824"/>
-            <w:shd w:fill="F8FAFC"/>
+            <w:tcW w:type="dxa" w:w="4896"/>
           </w:tcPr>
           <w:p>
             <w:pPr>
-              <w:spacing w:before="40" w:after="40"/>
+              <w:spacing w:before="30" w:after="30"/>
+            </w:pPr>
+            <w:r>
+              <w:rPr>
+                <w:rFonts w:ascii="Georgia" w:hAnsi="Georgia"/>
+                <w:b/>
+                <w:color w:val="0F172A"/>
+                <w:sz w:val="18"/>
+              </w:rPr>
+              <w:t>1.2 Le Terreau Azuréen : Sophia Antipolis, Grasse, Cannes &amp; Poids National</w:t>
+            </w:r>
+          </w:p>
+        </w:tc>
+        <w:tc>
+          <w:tcPr>
+            <w:tcW w:type="dxa" w:w="4896"/>
+          </w:tcPr>
+          <w:p>
+            <w:pPr>
+              <w:spacing w:before="30" w:after="30"/>
+              <w:jc w:val="right"/>
             </w:pPr>
             <w:r>
               <w:rPr>
                 <w:rFonts w:ascii="Arial" w:hAnsi="Arial"/>
                 <w:b/>
                 <w:color w:val="0F172A"/>
-                <w:sz w:val="19"/>
-              </w:rPr>
-              <w:t xml:space="preserve">   1.2 Le Terreau Azuréen : Sophia Antipolis, Grasse, Cannes &amp; Poids National</w:t>
-            </w:r>
-          </w:p>
-        </w:tc>
-        <w:tc>
-          <w:tcPr>
-            <w:tcW w:type="dxa" w:w="4824"/>
-            <w:shd w:fill="F8FAFC"/>
-          </w:tcPr>
-          <w:p>
-            <w:pPr>
-              <w:spacing w:before="40" w:after="40"/>
-              <w:jc w:val="right"/>
-            </w:pPr>
-            <w:r>
-              <w:rPr>
-                <w:rFonts w:ascii="Arial" w:hAnsi="Arial"/>
-                <w:i/>
-                <w:color w:val="64748B"/>
                 <w:sz w:val="18"/>
               </w:rPr>
-              <w:t>Page 3</w:t>
+              <w:t>2</w:t>
             </w:r>
           </w:p>
         </w:tc>
@@ -259,42 +292,40 @@
       <w:tr>
         <w:tc>
           <w:tcPr>
-            <w:tcW w:type="dxa" w:w="4824"/>
-            <w:shd w:fill="FFFFFF"/>
+            <w:tcW w:type="dxa" w:w="4896"/>
           </w:tcPr>
           <w:p>
             <w:pPr>
-              <w:spacing w:before="40" w:after="40"/>
+              <w:spacing w:before="30" w:after="30"/>
+            </w:pPr>
+            <w:r>
+              <w:rPr>
+                <w:rFonts w:ascii="Georgia" w:hAnsi="Georgia"/>
+                <w:b/>
+                <w:color w:val="0F172A"/>
+                <w:sz w:val="18"/>
+              </w:rPr>
+              <w:t>1.3 Atouts Monaco, Flux Transfrontaliers &amp; Extension Business</w:t>
+            </w:r>
+          </w:p>
+        </w:tc>
+        <w:tc>
+          <w:tcPr>
+            <w:tcW w:type="dxa" w:w="4896"/>
+          </w:tcPr>
+          <w:p>
+            <w:pPr>
+              <w:spacing w:before="30" w:after="30"/>
+              <w:jc w:val="right"/>
             </w:pPr>
             <w:r>
               <w:rPr>
                 <w:rFonts w:ascii="Arial" w:hAnsi="Arial"/>
                 <w:b/>
                 <w:color w:val="0F172A"/>
-                <w:sz w:val="19"/>
-              </w:rPr>
-              <w:t xml:space="preserve">   1.3 Atouts Monaco, Flux Transfrontaliers &amp; Extension Business</w:t>
-            </w:r>
-          </w:p>
-        </w:tc>
-        <w:tc>
-          <w:tcPr>
-            <w:tcW w:type="dxa" w:w="4824"/>
-            <w:shd w:fill="FFFFFF"/>
-          </w:tcPr>
-          <w:p>
-            <w:pPr>
-              <w:spacing w:before="40" w:after="40"/>
-              <w:jc w:val="right"/>
-            </w:pPr>
-            <w:r>
-              <w:rPr>
-                <w:rFonts w:ascii="Arial" w:hAnsi="Arial"/>
-                <w:i/>
-                <w:color w:val="64748B"/>
                 <w:sz w:val="18"/>
               </w:rPr>
-              <w:t>Page 4</w:t>
+              <w:t>3</w:t>
             </w:r>
           </w:p>
         </w:tc>
@@ -302,42 +333,40 @@
       <w:tr>
         <w:tc>
           <w:tcPr>
-            <w:tcW w:type="dxa" w:w="4824"/>
-            <w:shd w:fill="F8FAFC"/>
+            <w:tcW w:type="dxa" w:w="4896"/>
           </w:tcPr>
           <w:p>
             <w:pPr>
-              <w:spacing w:before="40" w:after="40"/>
+              <w:spacing w:before="30" w:after="30"/>
+            </w:pPr>
+            <w:r>
+              <w:rPr>
+                <w:rFonts w:ascii="Georgia" w:hAnsi="Georgia"/>
+                <w:b/>
+                <w:color w:val="0F172A"/>
+                <w:sz w:val="18"/>
+              </w:rPr>
+              <w:t>1.4 L'Opportunité Historique : 30 Md€ UE &amp; 7 AI Gigafactories</w:t>
+            </w:r>
+          </w:p>
+        </w:tc>
+        <w:tc>
+          <w:tcPr>
+            <w:tcW w:type="dxa" w:w="4896"/>
+          </w:tcPr>
+          <w:p>
+            <w:pPr>
+              <w:spacing w:before="30" w:after="30"/>
+              <w:jc w:val="right"/>
             </w:pPr>
             <w:r>
               <w:rPr>
                 <w:rFonts w:ascii="Arial" w:hAnsi="Arial"/>
                 <w:b/>
                 <w:color w:val="0F172A"/>
-                <w:sz w:val="19"/>
-              </w:rPr>
-              <w:t xml:space="preserve">   1.4 L'Opportunité Historique : 30 Md€ UE &amp; 7 AI Gigafactories</w:t>
-            </w:r>
-          </w:p>
-        </w:tc>
-        <w:tc>
-          <w:tcPr>
-            <w:tcW w:type="dxa" w:w="4824"/>
-            <w:shd w:fill="F8FAFC"/>
-          </w:tcPr>
-          <w:p>
-            <w:pPr>
-              <w:spacing w:before="40" w:after="40"/>
-              <w:jc w:val="right"/>
-            </w:pPr>
-            <w:r>
-              <w:rPr>
-                <w:rFonts w:ascii="Arial" w:hAnsi="Arial"/>
-                <w:i/>
-                <w:color w:val="64748B"/>
                 <w:sz w:val="18"/>
               </w:rPr>
-              <w:t>Page 4</w:t>
+              <w:t>4</w:t>
             </w:r>
           </w:p>
         </w:tc>
@@ -345,42 +374,40 @@
       <w:tr>
         <w:tc>
           <w:tcPr>
-            <w:tcW w:type="dxa" w:w="4824"/>
-            <w:shd w:fill="FFFFFF"/>
+            <w:tcW w:type="dxa" w:w="4896"/>
           </w:tcPr>
           <w:p>
             <w:pPr>
-              <w:spacing w:before="40" w:after="40"/>
+              <w:spacing w:before="30" w:after="30"/>
+            </w:pPr>
+            <w:r>
+              <w:rPr>
+                <w:rFonts w:ascii="Georgia" w:hAnsi="Georgia"/>
+                <w:b/>
+                <w:color w:val="0F172A"/>
+                <w:sz w:val="18"/>
+              </w:rPr>
+              <w:t>1.5 Structuration Opérationnelle &amp; Capture des Subventions</w:t>
+            </w:r>
+          </w:p>
+        </w:tc>
+        <w:tc>
+          <w:tcPr>
+            <w:tcW w:type="dxa" w:w="4896"/>
+          </w:tcPr>
+          <w:p>
+            <w:pPr>
+              <w:spacing w:before="30" w:after="30"/>
+              <w:jc w:val="right"/>
             </w:pPr>
             <w:r>
               <w:rPr>
                 <w:rFonts w:ascii="Arial" w:hAnsi="Arial"/>
                 <w:b/>
                 <w:color w:val="0F172A"/>
-                <w:sz w:val="19"/>
-              </w:rPr>
-              <w:t xml:space="preserve">   1.5 Structuration Opérationnelle &amp; Capture des Subventions</w:t>
-            </w:r>
-          </w:p>
-        </w:tc>
-        <w:tc>
-          <w:tcPr>
-            <w:tcW w:type="dxa" w:w="4824"/>
-            <w:shd w:fill="FFFFFF"/>
-          </w:tcPr>
-          <w:p>
-            <w:pPr>
-              <w:spacing w:before="40" w:after="40"/>
-              <w:jc w:val="right"/>
-            </w:pPr>
-            <w:r>
-              <w:rPr>
-                <w:rFonts w:ascii="Arial" w:hAnsi="Arial"/>
-                <w:i/>
-                <w:color w:val="64748B"/>
                 <w:sz w:val="18"/>
               </w:rPr>
-              <w:t>Page 5</w:t>
+              <w:t>4</w:t>
             </w:r>
           </w:p>
         </w:tc>
@@ -388,19 +415,18 @@
       <w:tr>
         <w:tc>
           <w:tcPr>
-            <w:tcW w:type="dxa" w:w="4824"/>
-            <w:shd w:fill="F8FAFC"/>
+            <w:tcW w:type="dxa" w:w="4896"/>
           </w:tcPr>
           <w:p>
             <w:pPr>
-              <w:spacing w:before="40" w:after="40"/>
+              <w:spacing w:before="30" w:after="30"/>
             </w:pPr>
             <w:r>
               <w:rPr>
-                <w:rFonts w:ascii="Arial" w:hAnsi="Arial"/>
+                <w:rFonts w:ascii="Georgia" w:hAnsi="Georgia"/>
                 <w:b/>
                 <w:color w:val="0F172A"/>
-                <w:sz w:val="19"/>
+                <w:sz w:val="18"/>
               </w:rPr>
               <w:t>2. Pôle 1 : Axe Ville de Nice (Sécurité &amp; Cadre de Vie)</w:t>
             </w:r>
@@ -408,22 +434,21 @@
         </w:tc>
         <w:tc>
           <w:tcPr>
-            <w:tcW w:type="dxa" w:w="4824"/>
-            <w:shd w:fill="F8FAFC"/>
+            <w:tcW w:type="dxa" w:w="4896"/>
           </w:tcPr>
           <w:p>
             <w:pPr>
-              <w:spacing w:before="40" w:after="40"/>
+              <w:spacing w:before="30" w:after="30"/>
               <w:jc w:val="right"/>
             </w:pPr>
             <w:r>
               <w:rPr>
                 <w:rFonts w:ascii="Arial" w:hAnsi="Arial"/>
-                <w:i/>
-                <w:color w:val="64748B"/>
+                <w:b/>
+                <w:color w:val="0F172A"/>
                 <w:sz w:val="18"/>
               </w:rPr>
-              <w:t>Page 5</w:t>
+              <w:t>5</w:t>
             </w:r>
           </w:p>
         </w:tc>
@@ -431,42 +456,40 @@
       <w:tr>
         <w:tc>
           <w:tcPr>
-            <w:tcW w:type="dxa" w:w="4824"/>
-            <w:shd w:fill="FFFFFF"/>
+            <w:tcW w:type="dxa" w:w="4896"/>
           </w:tcPr>
           <w:p>
             <w:pPr>
-              <w:spacing w:before="40" w:after="40"/>
+              <w:spacing w:before="30" w:after="30"/>
+            </w:pPr>
+            <w:r>
+              <w:rPr>
+                <w:rFonts w:ascii="Georgia" w:hAnsi="Georgia"/>
+                <w:b/>
+                <w:color w:val="0F172A"/>
+                <w:sz w:val="18"/>
+              </w:rPr>
+              <w:t>2.1 CSU Augmenté : Moins d'Écrans, Plus de Policiers dans la Rue</w:t>
+            </w:r>
+          </w:p>
+        </w:tc>
+        <w:tc>
+          <w:tcPr>
+            <w:tcW w:type="dxa" w:w="4896"/>
+          </w:tcPr>
+          <w:p>
+            <w:pPr>
+              <w:spacing w:before="30" w:after="30"/>
+              <w:jc w:val="right"/>
             </w:pPr>
             <w:r>
               <w:rPr>
                 <w:rFonts w:ascii="Arial" w:hAnsi="Arial"/>
                 <w:b/>
                 <w:color w:val="0F172A"/>
-                <w:sz w:val="19"/>
-              </w:rPr>
-              <w:t xml:space="preserve">   2.1 CSU Augmenté : Moins d'Écrans, Plus de Policiers dans la Rue</w:t>
-            </w:r>
-          </w:p>
-        </w:tc>
-        <w:tc>
-          <w:tcPr>
-            <w:tcW w:type="dxa" w:w="4824"/>
-            <w:shd w:fill="FFFFFF"/>
-          </w:tcPr>
-          <w:p>
-            <w:pPr>
-              <w:spacing w:before="40" w:after="40"/>
-              <w:jc w:val="right"/>
-            </w:pPr>
-            <w:r>
-              <w:rPr>
-                <w:rFonts w:ascii="Arial" w:hAnsi="Arial"/>
-                <w:i/>
-                <w:color w:val="64748B"/>
                 <w:sz w:val="18"/>
               </w:rPr>
-              <w:t>Page 5</w:t>
+              <w:t>5</w:t>
             </w:r>
           </w:p>
         </w:tc>
@@ -474,42 +497,40 @@
       <w:tr>
         <w:tc>
           <w:tcPr>
-            <w:tcW w:type="dxa" w:w="4824"/>
-            <w:shd w:fill="F8FAFC"/>
+            <w:tcW w:type="dxa" w:w="4896"/>
           </w:tcPr>
           <w:p>
             <w:pPr>
-              <w:spacing w:before="40" w:after="40"/>
+              <w:spacing w:before="30" w:after="30"/>
+            </w:pPr>
+            <w:r>
+              <w:rPr>
+                <w:rFonts w:ascii="Georgia" w:hAnsi="Georgia"/>
+                <w:b/>
+                <w:color w:val="0F172A"/>
+                <w:sz w:val="18"/>
+              </w:rPr>
+              <w:t>2.2 Guichet Vocal Allo Niçois 24/7 : Demandes d'Aide &amp; Sécurité</w:t>
+            </w:r>
+          </w:p>
+        </w:tc>
+        <w:tc>
+          <w:tcPr>
+            <w:tcW w:type="dxa" w:w="4896"/>
+          </w:tcPr>
+          <w:p>
+            <w:pPr>
+              <w:spacing w:before="30" w:after="30"/>
+              <w:jc w:val="right"/>
             </w:pPr>
             <w:r>
               <w:rPr>
                 <w:rFonts w:ascii="Arial" w:hAnsi="Arial"/>
                 <w:b/>
                 <w:color w:val="0F172A"/>
-                <w:sz w:val="19"/>
-              </w:rPr>
-              <w:t xml:space="preserve">   2.2 Guichet Vocal Allo Niçois 24/7 : Demandes d'Aide &amp; Sécurité</w:t>
-            </w:r>
-          </w:p>
-        </w:tc>
-        <w:tc>
-          <w:tcPr>
-            <w:tcW w:type="dxa" w:w="4824"/>
-            <w:shd w:fill="F8FAFC"/>
-          </w:tcPr>
-          <w:p>
-            <w:pPr>
-              <w:spacing w:before="40" w:after="40"/>
-              <w:jc w:val="right"/>
-            </w:pPr>
-            <w:r>
-              <w:rPr>
-                <w:rFonts w:ascii="Arial" w:hAnsi="Arial"/>
-                <w:i/>
-                <w:color w:val="64748B"/>
                 <w:sz w:val="18"/>
               </w:rPr>
-              <w:t>Page 6</w:t>
+              <w:t>5</w:t>
             </w:r>
           </w:p>
         </w:tc>
@@ -517,42 +538,40 @@
       <w:tr>
         <w:tc>
           <w:tcPr>
-            <w:tcW w:type="dxa" w:w="4824"/>
-            <w:shd w:fill="FFFFFF"/>
+            <w:tcW w:type="dxa" w:w="4896"/>
           </w:tcPr>
           <w:p>
             <w:pPr>
-              <w:spacing w:before="40" w:after="40"/>
+              <w:spacing w:before="30" w:after="30"/>
+            </w:pPr>
+            <w:r>
+              <w:rPr>
+                <w:rFonts w:ascii="Georgia" w:hAnsi="Georgia"/>
+                <w:b/>
+                <w:color w:val="0F172A"/>
+                <w:sz w:val="18"/>
+              </w:rPr>
+              <w:t>2.3 Propreté Augmentée &amp; Routage Intelligent de la Voie Publique</w:t>
+            </w:r>
+          </w:p>
+        </w:tc>
+        <w:tc>
+          <w:tcPr>
+            <w:tcW w:type="dxa" w:w="4896"/>
+          </w:tcPr>
+          <w:p>
+            <w:pPr>
+              <w:spacing w:before="30" w:after="30"/>
+              <w:jc w:val="right"/>
             </w:pPr>
             <w:r>
               <w:rPr>
                 <w:rFonts w:ascii="Arial" w:hAnsi="Arial"/>
                 <w:b/>
                 <w:color w:val="0F172A"/>
-                <w:sz w:val="19"/>
-              </w:rPr>
-              <w:t xml:space="preserve">   2.3 Propreté Augmentée &amp; Routage Voie Publique</w:t>
-            </w:r>
-          </w:p>
-        </w:tc>
-        <w:tc>
-          <w:tcPr>
-            <w:tcW w:type="dxa" w:w="4824"/>
-            <w:shd w:fill="FFFFFF"/>
-          </w:tcPr>
-          <w:p>
-            <w:pPr>
-              <w:spacing w:before="40" w:after="40"/>
-              <w:jc w:val="right"/>
-            </w:pPr>
-            <w:r>
-              <w:rPr>
-                <w:rFonts w:ascii="Arial" w:hAnsi="Arial"/>
-                <w:i/>
-                <w:color w:val="64748B"/>
                 <w:sz w:val="18"/>
               </w:rPr>
-              <w:t>Page 6</w:t>
+              <w:t>5</w:t>
             </w:r>
           </w:p>
         </w:tc>
@@ -560,42 +579,40 @@
       <w:tr>
         <w:tc>
           <w:tcPr>
-            <w:tcW w:type="dxa" w:w="4824"/>
-            <w:shd w:fill="F8FAFC"/>
+            <w:tcW w:type="dxa" w:w="4896"/>
           </w:tcPr>
           <w:p>
             <w:pPr>
-              <w:spacing w:before="40" w:after="40"/>
+              <w:spacing w:before="30" w:after="30"/>
+            </w:pPr>
+            <w:r>
+              <w:rPr>
+                <w:rFonts w:ascii="Georgia" w:hAnsi="Georgia"/>
+                <w:b/>
+                <w:color w:val="0F172A"/>
+                <w:sz w:val="18"/>
+              </w:rPr>
+              <w:t>2.4 Consultation Directe par Quartier via l'IA Einstein</w:t>
+            </w:r>
+          </w:p>
+        </w:tc>
+        <w:tc>
+          <w:tcPr>
+            <w:tcW w:type="dxa" w:w="4896"/>
+          </w:tcPr>
+          <w:p>
+            <w:pPr>
+              <w:spacing w:before="30" w:after="30"/>
+              <w:jc w:val="right"/>
             </w:pPr>
             <w:r>
               <w:rPr>
                 <w:rFonts w:ascii="Arial" w:hAnsi="Arial"/>
                 <w:b/>
                 <w:color w:val="0F172A"/>
-                <w:sz w:val="19"/>
-              </w:rPr>
-              <w:t xml:space="preserve">   2.4 Consultation Directe par Quartier via l'IA Einstein</w:t>
-            </w:r>
-          </w:p>
-        </w:tc>
-        <w:tc>
-          <w:tcPr>
-            <w:tcW w:type="dxa" w:w="4824"/>
-            <w:shd w:fill="F8FAFC"/>
-          </w:tcPr>
-          <w:p>
-            <w:pPr>
-              <w:spacing w:before="40" w:after="40"/>
-              <w:jc w:val="right"/>
-            </w:pPr>
-            <w:r>
-              <w:rPr>
-                <w:rFonts w:ascii="Arial" w:hAnsi="Arial"/>
-                <w:i/>
-                <w:color w:val="64748B"/>
                 <w:sz w:val="18"/>
               </w:rPr>
-              <w:t>Page 6</w:t>
+              <w:t>5</w:t>
             </w:r>
           </w:p>
         </w:tc>
@@ -603,42 +620,40 @@
       <w:tr>
         <w:tc>
           <w:tcPr>
-            <w:tcW w:type="dxa" w:w="4824"/>
-            <w:shd w:fill="FFFFFF"/>
+            <w:tcW w:type="dxa" w:w="4896"/>
           </w:tcPr>
           <w:p>
             <w:pPr>
-              <w:spacing w:before="40" w:after="40"/>
+              <w:spacing w:before="30" w:after="30"/>
+            </w:pPr>
+            <w:r>
+              <w:rPr>
+                <w:rFonts w:ascii="Georgia" w:hAnsi="Georgia"/>
+                <w:b/>
+                <w:color w:val="0F172A"/>
+                <w:sz w:val="18"/>
+              </w:rPr>
+              <w:t>3. Pôle 2 : Axe Métropole Nice Côte d'Azur (Budget, Cyber &amp; Monaco)</w:t>
+            </w:r>
+          </w:p>
+        </w:tc>
+        <w:tc>
+          <w:tcPr>
+            <w:tcW w:type="dxa" w:w="4896"/>
+          </w:tcPr>
+          <w:p>
+            <w:pPr>
+              <w:spacing w:before="30" w:after="30"/>
+              <w:jc w:val="right"/>
             </w:pPr>
             <w:r>
               <w:rPr>
                 <w:rFonts w:ascii="Arial" w:hAnsi="Arial"/>
                 <w:b/>
                 <w:color w:val="0F172A"/>
-                <w:sz w:val="19"/>
-              </w:rPr>
-              <w:t>3. Pôle 2 : Axe Métropole Nice Côte d'Azur (Budget &amp; Monaco)</w:t>
-            </w:r>
-          </w:p>
-        </w:tc>
-        <w:tc>
-          <w:tcPr>
-            <w:tcW w:type="dxa" w:w="4824"/>
-            <w:shd w:fill="FFFFFF"/>
-          </w:tcPr>
-          <w:p>
-            <w:pPr>
-              <w:spacing w:before="40" w:after="40"/>
-              <w:jc w:val="right"/>
-            </w:pPr>
-            <w:r>
-              <w:rPr>
-                <w:rFonts w:ascii="Arial" w:hAnsi="Arial"/>
-                <w:i/>
-                <w:color w:val="64748B"/>
                 <w:sz w:val="18"/>
               </w:rPr>
-              <w:t>Page 7</w:t>
+              <w:t>7</w:t>
             </w:r>
           </w:p>
         </w:tc>
@@ -646,42 +661,40 @@
       <w:tr>
         <w:tc>
           <w:tcPr>
-            <w:tcW w:type="dxa" w:w="4824"/>
-            <w:shd w:fill="F8FAFC"/>
+            <w:tcW w:type="dxa" w:w="4896"/>
           </w:tcPr>
           <w:p>
             <w:pPr>
-              <w:spacing w:before="40" w:after="40"/>
+              <w:spacing w:before="30" w:after="30"/>
+            </w:pPr>
+            <w:r>
+              <w:rPr>
+                <w:rFonts w:ascii="Georgia" w:hAnsi="Georgia"/>
+                <w:b/>
+                <w:color w:val="0F172A"/>
+                <w:sz w:val="18"/>
+              </w:rPr>
+              <w:t>3.1 Audit IA Commande Publique (+2,5 M€ / an Net)</w:t>
+            </w:r>
+          </w:p>
+        </w:tc>
+        <w:tc>
+          <w:tcPr>
+            <w:tcW w:type="dxa" w:w="4896"/>
+          </w:tcPr>
+          <w:p>
+            <w:pPr>
+              <w:spacing w:before="30" w:after="30"/>
+              <w:jc w:val="right"/>
             </w:pPr>
             <w:r>
               <w:rPr>
                 <w:rFonts w:ascii="Arial" w:hAnsi="Arial"/>
                 <w:b/>
                 <w:color w:val="0F172A"/>
-                <w:sz w:val="19"/>
-              </w:rPr>
-              <w:t xml:space="preserve">   3.1 Audit IA Commande Publique (+2,5 M€ / an Net)</w:t>
-            </w:r>
-          </w:p>
-        </w:tc>
-        <w:tc>
-          <w:tcPr>
-            <w:tcW w:type="dxa" w:w="4824"/>
-            <w:shd w:fill="F8FAFC"/>
-          </w:tcPr>
-          <w:p>
-            <w:pPr>
-              <w:spacing w:before="40" w:after="40"/>
-              <w:jc w:val="right"/>
-            </w:pPr>
-            <w:r>
-              <w:rPr>
-                <w:rFonts w:ascii="Arial" w:hAnsi="Arial"/>
-                <w:i/>
-                <w:color w:val="64748B"/>
                 <w:sz w:val="18"/>
               </w:rPr>
-              <w:t>Page 7</w:t>
+              <w:t>7</w:t>
             </w:r>
           </w:p>
         </w:tc>
@@ -689,42 +702,40 @@
       <w:tr>
         <w:tc>
           <w:tcPr>
-            <w:tcW w:type="dxa" w:w="4824"/>
-            <w:shd w:fill="FFFFFF"/>
+            <w:tcW w:type="dxa" w:w="4896"/>
           </w:tcPr>
           <w:p>
             <w:pPr>
-              <w:spacing w:before="40" w:after="40"/>
+              <w:spacing w:before="30" w:after="30"/>
+            </w:pPr>
+            <w:r>
+              <w:rPr>
+                <w:rFonts w:ascii="Georgia" w:hAnsi="Georgia"/>
+                <w:b/>
+                <w:color w:val="0F172A"/>
+                <w:sz w:val="18"/>
+              </w:rPr>
+              <w:t>3.2 Bouclier Cyber-IA NIS 2 (1,8 M€ à 3 M€ Évités)</w:t>
+            </w:r>
+          </w:p>
+        </w:tc>
+        <w:tc>
+          <w:tcPr>
+            <w:tcW w:type="dxa" w:w="4896"/>
+          </w:tcPr>
+          <w:p>
+            <w:pPr>
+              <w:spacing w:before="30" w:after="30"/>
+              <w:jc w:val="right"/>
             </w:pPr>
             <w:r>
               <w:rPr>
                 <w:rFonts w:ascii="Arial" w:hAnsi="Arial"/>
                 <w:b/>
                 <w:color w:val="0F172A"/>
-                <w:sz w:val="19"/>
-              </w:rPr>
-              <w:t xml:space="preserve">   3.2 Bouclier Cyber-IA NIS 2 (1,8 M€ à 3 M€ Évités)</w:t>
-            </w:r>
-          </w:p>
-        </w:tc>
-        <w:tc>
-          <w:tcPr>
-            <w:tcW w:type="dxa" w:w="4824"/>
-            <w:shd w:fill="FFFFFF"/>
-          </w:tcPr>
-          <w:p>
-            <w:pPr>
-              <w:spacing w:before="40" w:after="40"/>
-              <w:jc w:val="right"/>
-            </w:pPr>
-            <w:r>
-              <w:rPr>
-                <w:rFonts w:ascii="Arial" w:hAnsi="Arial"/>
-                <w:i/>
-                <w:color w:val="64748B"/>
                 <w:sz w:val="18"/>
               </w:rPr>
-              <w:t>Page 7</w:t>
+              <w:t>7</w:t>
             </w:r>
           </w:p>
         </w:tc>
@@ -732,42 +743,40 @@
       <w:tr>
         <w:tc>
           <w:tcPr>
-            <w:tcW w:type="dxa" w:w="4824"/>
-            <w:shd w:fill="F8FAFC"/>
+            <w:tcW w:type="dxa" w:w="4896"/>
           </w:tcPr>
           <w:p>
             <w:pPr>
-              <w:spacing w:before="40" w:after="40"/>
+              <w:spacing w:before="30" w:after="30"/>
+            </w:pPr>
+            <w:r>
+              <w:rPr>
+                <w:rFonts w:ascii="Georgia" w:hAnsi="Georgia"/>
+                <w:b/>
+                <w:color w:val="0F172A"/>
+                <w:sz w:val="18"/>
+              </w:rPr>
+              <w:t>3.3 Monaco Cloud &amp; Redondance IT (1,5 M€ à 2,8 M€ / an)</w:t>
+            </w:r>
+          </w:p>
+        </w:tc>
+        <w:tc>
+          <w:tcPr>
+            <w:tcW w:type="dxa" w:w="4896"/>
+          </w:tcPr>
+          <w:p>
+            <w:pPr>
+              <w:spacing w:before="30" w:after="30"/>
+              <w:jc w:val="right"/>
             </w:pPr>
             <w:r>
               <w:rPr>
                 <w:rFonts w:ascii="Arial" w:hAnsi="Arial"/>
                 <w:b/>
                 <w:color w:val="0F172A"/>
-                <w:sz w:val="19"/>
-              </w:rPr>
-              <w:t xml:space="preserve">   3.3 Monaco Cloud &amp; Redondance IT (1,5 M€ à 2,8 M€ / an)</w:t>
-            </w:r>
-          </w:p>
-        </w:tc>
-        <w:tc>
-          <w:tcPr>
-            <w:tcW w:type="dxa" w:w="4824"/>
-            <w:shd w:fill="F8FAFC"/>
-          </w:tcPr>
-          <w:p>
-            <w:pPr>
-              <w:spacing w:before="40" w:after="40"/>
-              <w:jc w:val="right"/>
-            </w:pPr>
-            <w:r>
-              <w:rPr>
-                <w:rFonts w:ascii="Arial" w:hAnsi="Arial"/>
-                <w:i/>
-                <w:color w:val="64748B"/>
                 <w:sz w:val="18"/>
               </w:rPr>
-              <w:t>Page 8</w:t>
+              <w:t>7</w:t>
             </w:r>
           </w:p>
         </w:tc>
@@ -775,19 +784,18 @@
       <w:tr>
         <w:tc>
           <w:tcPr>
-            <w:tcW w:type="dxa" w:w="4824"/>
-            <w:shd w:fill="FFFFFF"/>
+            <w:tcW w:type="dxa" w:w="4896"/>
           </w:tcPr>
           <w:p>
             <w:pPr>
-              <w:spacing w:before="40" w:after="40"/>
+              <w:spacing w:before="30" w:after="30"/>
             </w:pPr>
             <w:r>
               <w:rPr>
-                <w:rFonts w:ascii="Arial" w:hAnsi="Arial"/>
+                <w:rFonts w:ascii="Georgia" w:hAnsi="Georgia"/>
                 <w:b/>
                 <w:color w:val="0F172A"/>
-                <w:sz w:val="19"/>
+                <w:sz w:val="18"/>
               </w:rPr>
               <w:t>4. Alliance Binationale Nice-Monaco &amp; Hub Réglementaire</w:t>
             </w:r>
@@ -795,22 +803,21 @@
         </w:tc>
         <w:tc>
           <w:tcPr>
-            <w:tcW w:type="dxa" w:w="4824"/>
-            <w:shd w:fill="FFFFFF"/>
+            <w:tcW w:type="dxa" w:w="4896"/>
           </w:tcPr>
           <w:p>
             <w:pPr>
-              <w:spacing w:before="40" w:after="40"/>
+              <w:spacing w:before="30" w:after="30"/>
               <w:jc w:val="right"/>
             </w:pPr>
             <w:r>
               <w:rPr>
                 <w:rFonts w:ascii="Arial" w:hAnsi="Arial"/>
-                <w:i/>
-                <w:color w:val="64748B"/>
+                <w:b/>
+                <w:color w:val="0F172A"/>
                 <w:sz w:val="18"/>
               </w:rPr>
-              <w:t>Page 8</w:t>
+              <w:t>8</w:t>
             </w:r>
           </w:p>
         </w:tc>
@@ -818,42 +825,40 @@
       <w:tr>
         <w:tc>
           <w:tcPr>
-            <w:tcW w:type="dxa" w:w="4824"/>
-            <w:shd w:fill="F8FAFC"/>
+            <w:tcW w:type="dxa" w:w="4896"/>
           </w:tcPr>
           <w:p>
             <w:pPr>
-              <w:spacing w:before="40" w:after="40"/>
+              <w:spacing w:before="30" w:after="30"/>
+            </w:pPr>
+            <w:r>
+              <w:rPr>
+                <w:rFonts w:ascii="Georgia" w:hAnsi="Georgia"/>
+                <w:b/>
+                <w:color w:val="0F172A"/>
+                <w:sz w:val="18"/>
+              </w:rPr>
+              <w:t>4.1 Levier Binational : Clé de Voûte des Financements Européens</w:t>
+            </w:r>
+          </w:p>
+        </w:tc>
+        <w:tc>
+          <w:tcPr>
+            <w:tcW w:type="dxa" w:w="4896"/>
+          </w:tcPr>
+          <w:p>
+            <w:pPr>
+              <w:spacing w:before="30" w:after="30"/>
+              <w:jc w:val="right"/>
             </w:pPr>
             <w:r>
               <w:rPr>
                 <w:rFonts w:ascii="Arial" w:hAnsi="Arial"/>
                 <w:b/>
                 <w:color w:val="0F172A"/>
-                <w:sz w:val="19"/>
-              </w:rPr>
-              <w:t xml:space="preserve">   4.1 Levier Binational : Clé de Voûte des Financements Européens</w:t>
-            </w:r>
-          </w:p>
-        </w:tc>
-        <w:tc>
-          <w:tcPr>
-            <w:tcW w:type="dxa" w:w="4824"/>
-            <w:shd w:fill="F8FAFC"/>
-          </w:tcPr>
-          <w:p>
-            <w:pPr>
-              <w:spacing w:before="40" w:after="40"/>
-              <w:jc w:val="right"/>
-            </w:pPr>
-            <w:r>
-              <w:rPr>
-                <w:rFonts w:ascii="Arial" w:hAnsi="Arial"/>
-                <w:i/>
-                <w:color w:val="64748B"/>
                 <w:sz w:val="18"/>
               </w:rPr>
-              <w:t>Page 8</w:t>
+              <w:t>8</w:t>
             </w:r>
           </w:p>
         </w:tc>
@@ -861,42 +866,40 @@
       <w:tr>
         <w:tc>
           <w:tcPr>
-            <w:tcW w:type="dxa" w:w="4824"/>
-            <w:shd w:fill="FFFFFF"/>
+            <w:tcW w:type="dxa" w:w="4896"/>
           </w:tcPr>
           <w:p>
             <w:pPr>
-              <w:spacing w:before="40" w:after="40"/>
+              <w:spacing w:before="30" w:after="30"/>
+            </w:pPr>
+            <w:r>
+              <w:rPr>
+                <w:rFonts w:ascii="Georgia" w:hAnsi="Georgia"/>
+                <w:b/>
+                <w:color w:val="0F172A"/>
+                <w:sz w:val="18"/>
+              </w:rPr>
+              <w:t>4.2 Nice, Centre d'Expertise AI Act de Référence pour la France</w:t>
+            </w:r>
+          </w:p>
+        </w:tc>
+        <w:tc>
+          <w:tcPr>
+            <w:tcW w:type="dxa" w:w="4896"/>
+          </w:tcPr>
+          <w:p>
+            <w:pPr>
+              <w:spacing w:before="30" w:after="30"/>
+              <w:jc w:val="right"/>
             </w:pPr>
             <w:r>
               <w:rPr>
                 <w:rFonts w:ascii="Arial" w:hAnsi="Arial"/>
                 <w:b/>
                 <w:color w:val="0F172A"/>
-                <w:sz w:val="19"/>
-              </w:rPr>
-              <w:t xml:space="preserve">   4.2 Nice, Centre d'Expertise AI Act de Référence pour la France</w:t>
-            </w:r>
-          </w:p>
-        </w:tc>
-        <w:tc>
-          <w:tcPr>
-            <w:tcW w:type="dxa" w:w="4824"/>
-            <w:shd w:fill="FFFFFF"/>
-          </w:tcPr>
-          <w:p>
-            <w:pPr>
-              <w:spacing w:before="40" w:after="40"/>
-              <w:jc w:val="right"/>
-            </w:pPr>
-            <w:r>
-              <w:rPr>
-                <w:rFonts w:ascii="Arial" w:hAnsi="Arial"/>
-                <w:i/>
-                <w:color w:val="64748B"/>
                 <w:sz w:val="18"/>
               </w:rPr>
-              <w:t>Page 9</w:t>
+              <w:t>8</w:t>
             </w:r>
           </w:p>
         </w:tc>
@@ -904,42 +907,40 @@
       <w:tr>
         <w:tc>
           <w:tcPr>
-            <w:tcW w:type="dxa" w:w="4824"/>
-            <w:shd w:fill="F8FAFC"/>
+            <w:tcW w:type="dxa" w:w="4896"/>
           </w:tcPr>
           <w:p>
             <w:pPr>
-              <w:spacing w:before="40" w:after="40"/>
+              <w:spacing w:before="30" w:after="30"/>
+            </w:pPr>
+            <w:r>
+              <w:rPr>
+                <w:rFonts w:ascii="Georgia" w:hAnsi="Georgia"/>
+                <w:b/>
+                <w:color w:val="0F172A"/>
+                <w:sz w:val="18"/>
+              </w:rPr>
+              <w:t>4.3 Pôle d'Excellence PME/PMI &amp; Bibliothèque de Cas d'Usage Souverains</w:t>
+            </w:r>
+          </w:p>
+        </w:tc>
+        <w:tc>
+          <w:tcPr>
+            <w:tcW w:type="dxa" w:w="4896"/>
+          </w:tcPr>
+          <w:p>
+            <w:pPr>
+              <w:spacing w:before="30" w:after="30"/>
+              <w:jc w:val="right"/>
             </w:pPr>
             <w:r>
               <w:rPr>
                 <w:rFonts w:ascii="Arial" w:hAnsi="Arial"/>
                 <w:b/>
                 <w:color w:val="0F172A"/>
-                <w:sz w:val="19"/>
-              </w:rPr>
-              <w:t xml:space="preserve">   4.3 Pôle d'Excellence PME/PMI &amp; Bibliothèque de Cas d'Usage Souverains</w:t>
-            </w:r>
-          </w:p>
-        </w:tc>
-        <w:tc>
-          <w:tcPr>
-            <w:tcW w:type="dxa" w:w="4824"/>
-            <w:shd w:fill="F8FAFC"/>
-          </w:tcPr>
-          <w:p>
-            <w:pPr>
-              <w:spacing w:before="40" w:after="40"/>
-              <w:jc w:val="right"/>
-            </w:pPr>
-            <w:r>
-              <w:rPr>
-                <w:rFonts w:ascii="Arial" w:hAnsi="Arial"/>
-                <w:i/>
-                <w:color w:val="64748B"/>
                 <w:sz w:val="18"/>
               </w:rPr>
-              <w:t>Page 9</w:t>
+              <w:t>8</w:t>
             </w:r>
           </w:p>
         </w:tc>
@@ -947,42 +948,40 @@
       <w:tr>
         <w:tc>
           <w:tcPr>
-            <w:tcW w:type="dxa" w:w="4824"/>
-            <w:shd w:fill="FFFFFF"/>
+            <w:tcW w:type="dxa" w:w="4896"/>
           </w:tcPr>
           <w:p>
             <w:pPr>
-              <w:spacing w:before="40" w:after="40"/>
+              <w:spacing w:before="30" w:after="30"/>
+            </w:pPr>
+            <w:r>
+              <w:rPr>
+                <w:rFonts w:ascii="Georgia" w:hAnsi="Georgia"/>
+                <w:b/>
+                <w:color w:val="0F172A"/>
+                <w:sz w:val="18"/>
+              </w:rPr>
+              <w:t>4.4 Pôle d'Excellence pour les Niçoises et les Niçois</w:t>
+            </w:r>
+          </w:p>
+        </w:tc>
+        <w:tc>
+          <w:tcPr>
+            <w:tcW w:type="dxa" w:w="4896"/>
+          </w:tcPr>
+          <w:p>
+            <w:pPr>
+              <w:spacing w:before="30" w:after="30"/>
+              <w:jc w:val="right"/>
             </w:pPr>
             <w:r>
               <w:rPr>
                 <w:rFonts w:ascii="Arial" w:hAnsi="Arial"/>
                 <w:b/>
                 <w:color w:val="0F172A"/>
-                <w:sz w:val="19"/>
-              </w:rPr>
-              <w:t>5. Feuille de Route Précise (Septembre 2026-2029) &amp; Résumé Annuel</w:t>
-            </w:r>
-          </w:p>
-        </w:tc>
-        <w:tc>
-          <w:tcPr>
-            <w:tcW w:type="dxa" w:w="4824"/>
-            <w:shd w:fill="FFFFFF"/>
-          </w:tcPr>
-          <w:p>
-            <w:pPr>
-              <w:spacing w:before="40" w:after="40"/>
-              <w:jc w:val="right"/>
-            </w:pPr>
-            <w:r>
-              <w:rPr>
-                <w:rFonts w:ascii="Arial" w:hAnsi="Arial"/>
-                <w:i/>
-                <w:color w:val="64748B"/>
                 <w:sz w:val="18"/>
               </w:rPr>
-              <w:t>Page 10</w:t>
+              <w:t>9</w:t>
             </w:r>
           </w:p>
         </w:tc>
@@ -990,42 +989,40 @@
       <w:tr>
         <w:tc>
           <w:tcPr>
-            <w:tcW w:type="dxa" w:w="4824"/>
-            <w:shd w:fill="F8FAFC"/>
+            <w:tcW w:type="dxa" w:w="4896"/>
           </w:tcPr>
           <w:p>
             <w:pPr>
-              <w:spacing w:before="40" w:after="40"/>
+              <w:spacing w:before="30" w:after="30"/>
+            </w:pPr>
+            <w:r>
+              <w:rPr>
+                <w:rFonts w:ascii="Georgia" w:hAnsi="Georgia"/>
+                <w:b/>
+                <w:color w:val="0F172A"/>
+                <w:sz w:val="18"/>
+              </w:rPr>
+              <w:t>5. Feuille de Route Précise (Sept 2026-2029) &amp; Résumé Annuel</w:t>
+            </w:r>
+          </w:p>
+        </w:tc>
+        <w:tc>
+          <w:tcPr>
+            <w:tcW w:type="dxa" w:w="4896"/>
+          </w:tcPr>
+          <w:p>
+            <w:pPr>
+              <w:spacing w:before="30" w:after="30"/>
+              <w:jc w:val="right"/>
             </w:pPr>
             <w:r>
               <w:rPr>
                 <w:rFonts w:ascii="Arial" w:hAnsi="Arial"/>
                 <w:b/>
                 <w:color w:val="0F172A"/>
-                <w:sz w:val="19"/>
-              </w:rPr>
-              <w:t xml:space="preserve">   5.1 Présidence Éric Ciotti &amp; Direction Benoît SIGWALD (2,5j/sem)</w:t>
-            </w:r>
-          </w:p>
-        </w:tc>
-        <w:tc>
-          <w:tcPr>
-            <w:tcW w:type="dxa" w:w="4824"/>
-            <w:shd w:fill="F8FAFC"/>
-          </w:tcPr>
-          <w:p>
-            <w:pPr>
-              <w:spacing w:before="40" w:after="40"/>
-              <w:jc w:val="right"/>
-            </w:pPr>
-            <w:r>
-              <w:rPr>
-                <w:rFonts w:ascii="Arial" w:hAnsi="Arial"/>
-                <w:i/>
-                <w:color w:val="64748B"/>
                 <w:sz w:val="18"/>
               </w:rPr>
-              <w:t>Page 10</w:t>
+              <w:t>9</w:t>
             </w:r>
           </w:p>
         </w:tc>
@@ -1033,42 +1030,40 @@
       <w:tr>
         <w:tc>
           <w:tcPr>
-            <w:tcW w:type="dxa" w:w="4824"/>
-            <w:shd w:fill="FFFFFF"/>
+            <w:tcW w:type="dxa" w:w="4896"/>
           </w:tcPr>
           <w:p>
             <w:pPr>
-              <w:spacing w:before="40" w:after="40"/>
+              <w:spacing w:before="30" w:after="30"/>
+            </w:pPr>
+            <w:r>
+              <w:rPr>
+                <w:rFonts w:ascii="Georgia" w:hAnsi="Georgia"/>
+                <w:b/>
+                <w:color w:val="0F172A"/>
+                <w:sz w:val="18"/>
+              </w:rPr>
+              <w:t>5.1 Présidence Éric Ciotti &amp; Direction Benoît SIGWALD (2,5j/sem)</w:t>
+            </w:r>
+          </w:p>
+        </w:tc>
+        <w:tc>
+          <w:tcPr>
+            <w:tcW w:type="dxa" w:w="4896"/>
+          </w:tcPr>
+          <w:p>
+            <w:pPr>
+              <w:spacing w:before="30" w:after="30"/>
+              <w:jc w:val="right"/>
             </w:pPr>
             <w:r>
               <w:rPr>
                 <w:rFonts w:ascii="Arial" w:hAnsi="Arial"/>
                 <w:b/>
                 <w:color w:val="0F172A"/>
-                <w:sz w:val="19"/>
-              </w:rPr>
-              <w:t xml:space="preserve">   5.2 Échéancier Précis &amp; Jalons par Date (Septembre 2026-2029)</w:t>
-            </w:r>
-          </w:p>
-        </w:tc>
-        <w:tc>
-          <w:tcPr>
-            <w:tcW w:type="dxa" w:w="4824"/>
-            <w:shd w:fill="FFFFFF"/>
-          </w:tcPr>
-          <w:p>
-            <w:pPr>
-              <w:spacing w:before="40" w:after="40"/>
-              <w:jc w:val="right"/>
-            </w:pPr>
-            <w:r>
-              <w:rPr>
-                <w:rFonts w:ascii="Arial" w:hAnsi="Arial"/>
-                <w:i/>
-                <w:color w:val="64748B"/>
                 <w:sz w:val="18"/>
               </w:rPr>
-              <w:t>Page 10</w:t>
+              <w:t>9</w:t>
             </w:r>
           </w:p>
         </w:tc>
@@ -1076,42 +1071,40 @@
       <w:tr>
         <w:tc>
           <w:tcPr>
-            <w:tcW w:type="dxa" w:w="4824"/>
-            <w:shd w:fill="F8FAFC"/>
+            <w:tcW w:type="dxa" w:w="4896"/>
           </w:tcPr>
           <w:p>
             <w:pPr>
-              <w:spacing w:before="40" w:after="40"/>
+              <w:spacing w:before="30" w:after="30"/>
+            </w:pPr>
+            <w:r>
+              <w:rPr>
+                <w:rFonts w:ascii="Georgia" w:hAnsi="Georgia"/>
+                <w:b/>
+                <w:color w:val="0F172A"/>
+                <w:sz w:val="18"/>
+              </w:rPr>
+              <w:t>5.2 Échéancier Précis et Jalons par Date (Démarche 1er Septembre 2026)</w:t>
+            </w:r>
+          </w:p>
+        </w:tc>
+        <w:tc>
+          <w:tcPr>
+            <w:tcW w:type="dxa" w:w="4896"/>
+          </w:tcPr>
+          <w:p>
+            <w:pPr>
+              <w:spacing w:before="30" w:after="30"/>
+              <w:jc w:val="right"/>
             </w:pPr>
             <w:r>
               <w:rPr>
                 <w:rFonts w:ascii="Arial" w:hAnsi="Arial"/>
                 <w:b/>
                 <w:color w:val="0F172A"/>
-                <w:sz w:val="19"/>
-              </w:rPr>
-              <w:t xml:space="preserve">   5.3 Résumé Consolidé du Coût par Année Budgétaire</w:t>
-            </w:r>
-          </w:p>
-        </w:tc>
-        <w:tc>
-          <w:tcPr>
-            <w:tcW w:type="dxa" w:w="4824"/>
-            <w:shd w:fill="F8FAFC"/>
-          </w:tcPr>
-          <w:p>
-            <w:pPr>
-              <w:spacing w:before="40" w:after="40"/>
-              <w:jc w:val="right"/>
-            </w:pPr>
-            <w:r>
-              <w:rPr>
-                <w:rFonts w:ascii="Arial" w:hAnsi="Arial"/>
-                <w:i/>
-                <w:color w:val="64748B"/>
                 <w:sz w:val="18"/>
               </w:rPr>
-              <w:t>Page 11</w:t>
+              <w:t>9</w:t>
             </w:r>
           </w:p>
         </w:tc>
@@ -1119,19 +1112,59 @@
       <w:tr>
         <w:tc>
           <w:tcPr>
-            <w:tcW w:type="dxa" w:w="4824"/>
-            <w:shd w:fill="FFFFFF"/>
+            <w:tcW w:type="dxa" w:w="4896"/>
           </w:tcPr>
           <w:p>
             <w:pPr>
-              <w:spacing w:before="40" w:after="40"/>
+              <w:spacing w:before="30" w:after="30"/>
+            </w:pPr>
+            <w:r>
+              <w:rPr>
+                <w:rFonts w:ascii="Georgia" w:hAnsi="Georgia"/>
+                <w:b/>
+                <w:color w:val="0F172A"/>
+                <w:sz w:val="18"/>
+              </w:rPr>
+              <w:t>5.3 Résumé Consolidé du Coût par Axe Institutionnel (Mairie, Métropole, Monaco)</w:t>
+            </w:r>
+          </w:p>
+        </w:tc>
+        <w:tc>
+          <w:tcPr>
+            <w:tcW w:type="dxa" w:w="4896"/>
+          </w:tcPr>
+          <w:p>
+            <w:pPr>
+              <w:spacing w:before="30" w:after="30"/>
+              <w:jc w:val="right"/>
             </w:pPr>
             <w:r>
               <w:rPr>
                 <w:rFonts w:ascii="Arial" w:hAnsi="Arial"/>
                 <w:b/>
                 <w:color w:val="0F172A"/>
-                <w:sz w:val="19"/>
+                <w:sz w:val="18"/>
+              </w:rPr>
+              <w:t>10</w:t>
+            </w:r>
+          </w:p>
+        </w:tc>
+      </w:tr>
+      <w:tr>
+        <w:tc>
+          <w:tcPr>
+            <w:tcW w:type="dxa" w:w="4896"/>
+          </w:tcPr>
+          <w:p>
+            <w:pPr>
+              <w:spacing w:before="30" w:after="30"/>
+            </w:pPr>
+            <w:r>
+              <w:rPr>
+                <w:rFonts w:ascii="Georgia" w:hAnsi="Georgia"/>
+                <w:b/>
+                <w:color w:val="0F172A"/>
+                <w:sz w:val="18"/>
               </w:rPr>
               <w:t>6. Annexe : Justifications des Gains &amp; Sources Documentaires</w:t>
             </w:r>
@@ -1139,32 +1172,26 @@
         </w:tc>
         <w:tc>
           <w:tcPr>
-            <w:tcW w:type="dxa" w:w="4824"/>
-            <w:shd w:fill="FFFFFF"/>
+            <w:tcW w:type="dxa" w:w="4896"/>
           </w:tcPr>
           <w:p>
             <w:pPr>
-              <w:spacing w:before="40" w:after="40"/>
+              <w:spacing w:before="30" w:after="30"/>
               <w:jc w:val="right"/>
             </w:pPr>
             <w:r>
               <w:rPr>
                 <w:rFonts w:ascii="Arial" w:hAnsi="Arial"/>
-                <w:i/>
-                <w:color w:val="64748B"/>
+                <w:b/>
+                <w:color w:val="0F172A"/>
                 <w:sz w:val="18"/>
               </w:rPr>
-              <w:t>Page 12</w:t>
+              <w:t>11</w:t>
             </w:r>
           </w:p>
         </w:tc>
       </w:tr>
     </w:tbl>
-    <w:p>
-      <w:r>
-        <w:br w:type="page"/>
-      </w:r>
-    </w:p>
     <w:p>
       <w:pPr>
         <w:pStyle w:val="Heading1"/>
@@ -1292,15 +1319,15 @@
         <w:tblLook w:firstColumn="1" w:firstRow="1" w:lastColumn="0" w:lastRow="0" w:noHBand="0" w:noVBand="1" w:val="04A0"/>
       </w:tblPr>
       <w:tblGrid>
-        <w:gridCol w:w="2412"/>
-        <w:gridCol w:w="2412"/>
-        <w:gridCol w:w="2412"/>
-        <w:gridCol w:w="2412"/>
+        <w:gridCol w:w="2448"/>
+        <w:gridCol w:w="2448"/>
+        <w:gridCol w:w="2448"/>
+        <w:gridCol w:w="2448"/>
       </w:tblGrid>
       <w:tr>
         <w:tc>
           <w:tcPr>
-            <w:tcW w:type="dxa" w:w="2412"/>
+            <w:tcW w:type="dxa" w:w="2448"/>
             <w:shd w:fill="1E293B"/>
           </w:tcPr>
           <w:p>
@@ -1320,7 +1347,7 @@
         </w:tc>
         <w:tc>
           <w:tcPr>
-            <w:tcW w:type="dxa" w:w="2412"/>
+            <w:tcW w:type="dxa" w:w="2448"/>
             <w:shd w:fill="1E293B"/>
           </w:tcPr>
           <w:p>
@@ -1340,7 +1367,7 @@
         </w:tc>
         <w:tc>
           <w:tcPr>
-            <w:tcW w:type="dxa" w:w="2412"/>
+            <w:tcW w:type="dxa" w:w="2448"/>
             <w:shd w:fill="1E293B"/>
           </w:tcPr>
           <w:p>
@@ -1360,7 +1387,7 @@
         </w:tc>
         <w:tc>
           <w:tcPr>
-            <w:tcW w:type="dxa" w:w="2412"/>
+            <w:tcW w:type="dxa" w:w="2448"/>
             <w:shd w:fill="1E293B"/>
           </w:tcPr>
           <w:p>
@@ -1382,7 +1409,7 @@
       <w:tr>
         <w:tc>
           <w:tcPr>
-            <w:tcW w:type="dxa" w:w="2412"/>
+            <w:tcW w:type="dxa" w:w="2448"/>
             <w:shd w:fill="F8FAFC"/>
           </w:tcPr>
           <w:p>
@@ -1401,7 +1428,7 @@
         </w:tc>
         <w:tc>
           <w:tcPr>
-            <w:tcW w:type="dxa" w:w="2412"/>
+            <w:tcW w:type="dxa" w:w="2448"/>
             <w:shd w:fill="F8FAFC"/>
           </w:tcPr>
           <w:p>
@@ -1420,7 +1447,7 @@
         </w:tc>
         <w:tc>
           <w:tcPr>
-            <w:tcW w:type="dxa" w:w="2412"/>
+            <w:tcW w:type="dxa" w:w="2448"/>
             <w:shd w:fill="F8FAFC"/>
           </w:tcPr>
           <w:p>
@@ -1439,7 +1466,7 @@
         </w:tc>
         <w:tc>
           <w:tcPr>
-            <w:tcW w:type="dxa" w:w="2412"/>
+            <w:tcW w:type="dxa" w:w="2448"/>
             <w:shd w:fill="F8FAFC"/>
           </w:tcPr>
           <w:p>
@@ -1460,7 +1487,7 @@
       <w:tr>
         <w:tc>
           <w:tcPr>
-            <w:tcW w:type="dxa" w:w="2412"/>
+            <w:tcW w:type="dxa" w:w="2448"/>
             <w:shd w:fill="FFFFFF"/>
           </w:tcPr>
           <w:p>
@@ -1479,7 +1506,7 @@
         </w:tc>
         <w:tc>
           <w:tcPr>
-            <w:tcW w:type="dxa" w:w="2412"/>
+            <w:tcW w:type="dxa" w:w="2448"/>
             <w:shd w:fill="FFFFFF"/>
           </w:tcPr>
           <w:p>
@@ -1498,7 +1525,7 @@
         </w:tc>
         <w:tc>
           <w:tcPr>
-            <w:tcW w:type="dxa" w:w="2412"/>
+            <w:tcW w:type="dxa" w:w="2448"/>
             <w:shd w:fill="FFFFFF"/>
           </w:tcPr>
           <w:p>
@@ -1517,7 +1544,7 @@
         </w:tc>
         <w:tc>
           <w:tcPr>
-            <w:tcW w:type="dxa" w:w="2412"/>
+            <w:tcW w:type="dxa" w:w="2448"/>
             <w:shd w:fill="FFFFFF"/>
           </w:tcPr>
           <w:p>
@@ -1538,7 +1565,7 @@
       <w:tr>
         <w:tc>
           <w:tcPr>
-            <w:tcW w:type="dxa" w:w="2412"/>
+            <w:tcW w:type="dxa" w:w="2448"/>
             <w:shd w:fill="F8FAFC"/>
           </w:tcPr>
           <w:p>
@@ -1557,7 +1584,7 @@
         </w:tc>
         <w:tc>
           <w:tcPr>
-            <w:tcW w:type="dxa" w:w="2412"/>
+            <w:tcW w:type="dxa" w:w="2448"/>
             <w:shd w:fill="F8FAFC"/>
           </w:tcPr>
           <w:p>
@@ -1576,7 +1603,7 @@
         </w:tc>
         <w:tc>
           <w:tcPr>
-            <w:tcW w:type="dxa" w:w="2412"/>
+            <w:tcW w:type="dxa" w:w="2448"/>
             <w:shd w:fill="F8FAFC"/>
           </w:tcPr>
           <w:p>
@@ -1595,7 +1622,7 @@
         </w:tc>
         <w:tc>
           <w:tcPr>
-            <w:tcW w:type="dxa" w:w="2412"/>
+            <w:tcW w:type="dxa" w:w="2448"/>
             <w:shd w:fill="F8FAFC"/>
           </w:tcPr>
           <w:p>
@@ -1616,7 +1643,7 @@
       <w:tr>
         <w:tc>
           <w:tcPr>
-            <w:tcW w:type="dxa" w:w="2412"/>
+            <w:tcW w:type="dxa" w:w="2448"/>
             <w:shd w:fill="FFFFFF"/>
           </w:tcPr>
           <w:p>
@@ -1635,7 +1662,7 @@
         </w:tc>
         <w:tc>
           <w:tcPr>
-            <w:tcW w:type="dxa" w:w="2412"/>
+            <w:tcW w:type="dxa" w:w="2448"/>
             <w:shd w:fill="FFFFFF"/>
           </w:tcPr>
           <w:p>
@@ -1654,7 +1681,7 @@
         </w:tc>
         <w:tc>
           <w:tcPr>
-            <w:tcW w:type="dxa" w:w="2412"/>
+            <w:tcW w:type="dxa" w:w="2448"/>
             <w:shd w:fill="FFFFFF"/>
           </w:tcPr>
           <w:p>
@@ -1673,7 +1700,7 @@
         </w:tc>
         <w:tc>
           <w:tcPr>
-            <w:tcW w:type="dxa" w:w="2412"/>
+            <w:tcW w:type="dxa" w:w="2448"/>
             <w:shd w:fill="FFFFFF"/>
           </w:tcPr>
           <w:p>
@@ -1694,7 +1721,7 @@
       <w:tr>
         <w:tc>
           <w:tcPr>
-            <w:tcW w:type="dxa" w:w="2412"/>
+            <w:tcW w:type="dxa" w:w="2448"/>
             <w:shd w:fill="F8FAFC"/>
           </w:tcPr>
           <w:p>
@@ -1713,7 +1740,7 @@
         </w:tc>
         <w:tc>
           <w:tcPr>
-            <w:tcW w:type="dxa" w:w="2412"/>
+            <w:tcW w:type="dxa" w:w="2448"/>
             <w:shd w:fill="F8FAFC"/>
           </w:tcPr>
           <w:p>
@@ -1732,7 +1759,7 @@
         </w:tc>
         <w:tc>
           <w:tcPr>
-            <w:tcW w:type="dxa" w:w="2412"/>
+            <w:tcW w:type="dxa" w:w="2448"/>
             <w:shd w:fill="F8FAFC"/>
           </w:tcPr>
           <w:p>
@@ -1751,7 +1778,7 @@
         </w:tc>
         <w:tc>
           <w:tcPr>
-            <w:tcW w:type="dxa" w:w="2412"/>
+            <w:tcW w:type="dxa" w:w="2448"/>
             <w:shd w:fill="F8FAFC"/>
           </w:tcPr>
           <w:p>
@@ -1774,618 +1801,6 @@
       <w:pPr>
         <w:spacing w:after="120"/>
       </w:pPr>
-    </w:p>
-    <w:p>
-      <w:pPr>
-        <w:pStyle w:val="Heading2"/>
-        <w:keepNext/>
-        <w:spacing w:before="280" w:after="120"/>
-      </w:pPr>
-      <w:r>
-        <w:rPr>
-          <w:rFonts w:ascii="Georgia" w:hAnsi="Georgia"/>
-          <w:b/>
-          <w:color w:val="1E3A8A"/>
-          <w:sz w:val="25"/>
-        </w:rPr>
-        <w:t>Ventilation du Coût Budgétaire IA par Allocation (435 k€ / an)</w:t>
-      </w:r>
-    </w:p>
-    <w:p>
-      <w:pPr>
-        <w:pStyle w:val="ListBullet"/>
-        <w:spacing w:before="40" w:after="100" w:line="276" w:lineRule="auto"/>
-        <w:ind w:left="504"/>
-      </w:pPr>
-      <w:r>
-        <w:rPr>
-          <w:rFonts w:ascii="Arial" w:hAnsi="Arial"/>
-          <w:b/>
-          <w:color w:val="0F172A"/>
-        </w:rPr>
-        <w:t>Découpage des Dépenses</w:t>
-      </w:r>
-      <w:r>
-        <w:rPr>
-          <w:rFonts w:ascii="Arial" w:hAnsi="Arial"/>
-          <w:color w:val="1E293B"/>
-        </w:rPr>
-        <w:t xml:space="preserve"> : L'investissement annuel brut est optimisé à </w:t>
-      </w:r>
-      <w:r>
-        <w:rPr>
-          <w:rFonts w:ascii="Arial" w:hAnsi="Arial"/>
-          <w:b/>
-          <w:color w:val="0F172A"/>
-        </w:rPr>
-        <w:t>435 k€ / an</w:t>
-      </w:r>
-      <w:r>
-        <w:rPr>
-          <w:rFonts w:ascii="Arial" w:hAnsi="Arial"/>
-          <w:color w:val="1E293B"/>
-        </w:rPr>
-        <w:t xml:space="preserve"> (grâce à l'engagement en temps partagé 2,5j/sem de la Direction de Projet à 65 k€). Avec le co-financement UE (</w:t>
-      </w:r>
-      <w:r>
-        <w:rPr>
-          <w:rFonts w:ascii="Arial" w:hAnsi="Arial"/>
-          <w:i/>
-        </w:rPr>
-        <w:t>Digital Europe</w:t>
-      </w:r>
-      <w:r>
-        <w:rPr>
-          <w:rFonts w:ascii="Arial" w:hAnsi="Arial"/>
-          <w:color w:val="1E293B"/>
-        </w:rPr>
-        <w:t xml:space="preserve"> à 50 %), le reste à charge net métropolitain descend à seulement </w:t>
-      </w:r>
-      <w:r>
-        <w:rPr>
-          <w:rFonts w:ascii="Arial" w:hAnsi="Arial"/>
-          <w:b/>
-          <w:color w:val="0F172A"/>
-        </w:rPr>
-        <w:t>~217 k€ / an</w:t>
-      </w:r>
-      <w:r>
-        <w:rPr>
-          <w:rFonts w:ascii="Arial" w:hAnsi="Arial"/>
-          <w:color w:val="1E293B"/>
-        </w:rPr>
-        <w:t>.</w:t>
-      </w:r>
-    </w:p>
-    <w:tbl>
-      <w:tblPr>
-        <w:tblW w:type="auto" w:w="0"/>
-        <w:jc w:val="center"/>
-        <w:tblLook w:firstColumn="1" w:firstRow="1" w:lastColumn="0" w:lastRow="0" w:noHBand="0" w:noVBand="1" w:val="04A0"/>
-      </w:tblPr>
-      <w:tblGrid>
-        <w:gridCol w:w="2412"/>
-        <w:gridCol w:w="2412"/>
-        <w:gridCol w:w="2412"/>
-        <w:gridCol w:w="2412"/>
-      </w:tblGrid>
-      <w:tr>
-        <w:tc>
-          <w:tcPr>
-            <w:tcW w:type="dxa" w:w="2412"/>
-            <w:shd w:fill="1E293B"/>
-          </w:tcPr>
-          <w:p>
-            <w:pPr>
-              <w:spacing w:before="60" w:after="60"/>
-            </w:pPr>
-            <w:r>
-              <w:rPr>
-                <w:rFonts w:ascii="Arial" w:hAnsi="Arial"/>
-                <w:b/>
-                <w:color w:val="FFFFFF"/>
-                <w:sz w:val="17"/>
-              </w:rPr>
-              <w:t>Poste d'Allocation Budgétaire</w:t>
-            </w:r>
-          </w:p>
-        </w:tc>
-        <w:tc>
-          <w:tcPr>
-            <w:tcW w:type="dxa" w:w="2412"/>
-            <w:shd w:fill="1E293B"/>
-          </w:tcPr>
-          <w:p>
-            <w:pPr>
-              <w:spacing w:before="60" w:after="60"/>
-            </w:pPr>
-            <w:r>
-              <w:rPr>
-                <w:rFonts w:ascii="Arial" w:hAnsi="Arial"/>
-                <w:b/>
-                <w:color w:val="FFFFFF"/>
-                <w:sz w:val="17"/>
-              </w:rPr>
-              <w:t>Montant Annuel</w:t>
-            </w:r>
-          </w:p>
-        </w:tc>
-        <w:tc>
-          <w:tcPr>
-            <w:tcW w:type="dxa" w:w="2412"/>
-            <w:shd w:fill="1E293B"/>
-          </w:tcPr>
-          <w:p>
-            <w:pPr>
-              <w:spacing w:before="60" w:after="60"/>
-            </w:pPr>
-            <w:r>
-              <w:rPr>
-                <w:rFonts w:ascii="Arial" w:hAnsi="Arial"/>
-                <w:b/>
-                <w:color w:val="FFFFFF"/>
-                <w:sz w:val="17"/>
-              </w:rPr>
-              <w:t>Part (%)</w:t>
-            </w:r>
-          </w:p>
-        </w:tc>
-        <w:tc>
-          <w:tcPr>
-            <w:tcW w:type="dxa" w:w="2412"/>
-            <w:shd w:fill="1E293B"/>
-          </w:tcPr>
-          <w:p>
-            <w:pPr>
-              <w:spacing w:before="60" w:after="60"/>
-            </w:pPr>
-            <w:r>
-              <w:rPr>
-                <w:rFonts w:ascii="Arial" w:hAnsi="Arial"/>
-                <w:b/>
-                <w:color w:val="FFFFFF"/>
-                <w:sz w:val="17"/>
-              </w:rPr>
-              <w:t>Destination Opérationnelle</w:t>
-            </w:r>
-          </w:p>
-        </w:tc>
-      </w:tr>
-      <w:tr>
-        <w:tc>
-          <w:tcPr>
-            <w:tcW w:type="dxa" w:w="2412"/>
-            <w:shd w:fill="F8FAFC"/>
-          </w:tcPr>
-          <w:p>
-            <w:pPr>
-              <w:spacing w:before="60" w:after="60"/>
-            </w:pPr>
-            <w:r>
-              <w:rPr>
-                <w:rFonts w:ascii="Arial" w:hAnsi="Arial"/>
-                <w:color w:val="1E293B"/>
-                <w:sz w:val="16"/>
-              </w:rPr>
-              <w:t>1. Licences Algorithmiques &amp; Modèles Souverains</w:t>
-            </w:r>
-          </w:p>
-        </w:tc>
-        <w:tc>
-          <w:tcPr>
-            <w:tcW w:type="dxa" w:w="2412"/>
-            <w:shd w:fill="F8FAFC"/>
-          </w:tcPr>
-          <w:p>
-            <w:pPr>
-              <w:spacing w:before="60" w:after="60"/>
-            </w:pPr>
-            <w:r>
-              <w:rPr>
-                <w:rFonts w:ascii="Arial" w:hAnsi="Arial"/>
-                <w:color w:val="1E293B"/>
-                <w:sz w:val="16"/>
-              </w:rPr>
-              <w:t>150 k€</w:t>
-            </w:r>
-          </w:p>
-        </w:tc>
-        <w:tc>
-          <w:tcPr>
-            <w:tcW w:type="dxa" w:w="2412"/>
-            <w:shd w:fill="F8FAFC"/>
-          </w:tcPr>
-          <w:p>
-            <w:pPr>
-              <w:spacing w:before="60" w:after="60"/>
-            </w:pPr>
-            <w:r>
-              <w:rPr>
-                <w:rFonts w:ascii="Arial" w:hAnsi="Arial"/>
-                <w:color w:val="1E293B"/>
-                <w:sz w:val="16"/>
-              </w:rPr>
-              <w:t>34,5 %</w:t>
-            </w:r>
-          </w:p>
-        </w:tc>
-        <w:tc>
-          <w:tcPr>
-            <w:tcW w:type="dxa" w:w="2412"/>
-            <w:shd w:fill="F8FAFC"/>
-          </w:tcPr>
-          <w:p>
-            <w:pPr>
-              <w:spacing w:before="60" w:after="60"/>
-            </w:pPr>
-            <w:r>
-              <w:rPr>
-                <w:rFonts w:ascii="Arial" w:hAnsi="Arial"/>
-                <w:color w:val="1E293B"/>
-                <w:sz w:val="16"/>
-              </w:rPr>
-              <w:t>Inférence VSA CSU, modèles locaux et API sécurisées.</w:t>
-            </w:r>
-          </w:p>
-        </w:tc>
-      </w:tr>
-      <w:tr>
-        <w:tc>
-          <w:tcPr>
-            <w:tcW w:type="dxa" w:w="2412"/>
-            <w:shd w:fill="FFFFFF"/>
-          </w:tcPr>
-          <w:p>
-            <w:pPr>
-              <w:spacing w:before="60" w:after="60"/>
-            </w:pPr>
-            <w:r>
-              <w:rPr>
-                <w:rFonts w:ascii="Arial" w:hAnsi="Arial"/>
-                <w:color w:val="1E293B"/>
-                <w:sz w:val="16"/>
-              </w:rPr>
-              <w:t>2. Cloud Souverain &amp; Fibre Monaco Cloud</w:t>
-            </w:r>
-          </w:p>
-        </w:tc>
-        <w:tc>
-          <w:tcPr>
-            <w:tcW w:type="dxa" w:w="2412"/>
-            <w:shd w:fill="FFFFFF"/>
-          </w:tcPr>
-          <w:p>
-            <w:pPr>
-              <w:spacing w:before="60" w:after="60"/>
-            </w:pPr>
-            <w:r>
-              <w:rPr>
-                <w:rFonts w:ascii="Arial" w:hAnsi="Arial"/>
-                <w:color w:val="1E293B"/>
-                <w:sz w:val="16"/>
-              </w:rPr>
-              <w:t>120 k€</w:t>
-            </w:r>
-          </w:p>
-        </w:tc>
-        <w:tc>
-          <w:tcPr>
-            <w:tcW w:type="dxa" w:w="2412"/>
-            <w:shd w:fill="FFFFFF"/>
-          </w:tcPr>
-          <w:p>
-            <w:pPr>
-              <w:spacing w:before="60" w:after="60"/>
-            </w:pPr>
-            <w:r>
-              <w:rPr>
-                <w:rFonts w:ascii="Arial" w:hAnsi="Arial"/>
-                <w:color w:val="1E293B"/>
-                <w:sz w:val="16"/>
-              </w:rPr>
-              <w:t>27,6 %</w:t>
-            </w:r>
-          </w:p>
-        </w:tc>
-        <w:tc>
-          <w:tcPr>
-            <w:tcW w:type="dxa" w:w="2412"/>
-            <w:shd w:fill="FFFFFF"/>
-          </w:tcPr>
-          <w:p>
-            <w:pPr>
-              <w:spacing w:before="60" w:after="60"/>
-            </w:pPr>
-            <w:r>
-              <w:rPr>
-                <w:rFonts w:ascii="Arial" w:hAnsi="Arial"/>
-                <w:color w:val="1E293B"/>
-                <w:sz w:val="16"/>
-              </w:rPr>
-              <w:t>Instances GPU certifiées AMSN et liaison fibre dédiée.</w:t>
-            </w:r>
-          </w:p>
-        </w:tc>
-      </w:tr>
-      <w:tr>
-        <w:tc>
-          <w:tcPr>
-            <w:tcW w:type="dxa" w:w="2412"/>
-            <w:shd w:fill="F8FAFC"/>
-          </w:tcPr>
-          <w:p>
-            <w:pPr>
-              <w:spacing w:before="60" w:after="60"/>
-            </w:pPr>
-            <w:r>
-              <w:rPr>
-                <w:rFonts w:ascii="Arial" w:hAnsi="Arial"/>
-                <w:color w:val="1E293B"/>
-                <w:sz w:val="16"/>
-              </w:rPr>
-              <w:t>3. Direction de Projet (Benoît SIGWALD - 2,5j/sem)</w:t>
-            </w:r>
-          </w:p>
-        </w:tc>
-        <w:tc>
-          <w:tcPr>
-            <w:tcW w:type="dxa" w:w="2412"/>
-            <w:shd w:fill="F8FAFC"/>
-          </w:tcPr>
-          <w:p>
-            <w:pPr>
-              <w:spacing w:before="60" w:after="60"/>
-            </w:pPr>
-            <w:r>
-              <w:rPr>
-                <w:rFonts w:ascii="Arial" w:hAnsi="Arial"/>
-                <w:color w:val="1E293B"/>
-                <w:sz w:val="16"/>
-              </w:rPr>
-              <w:t>65 k€</w:t>
-            </w:r>
-          </w:p>
-        </w:tc>
-        <w:tc>
-          <w:tcPr>
-            <w:tcW w:type="dxa" w:w="2412"/>
-            <w:shd w:fill="F8FAFC"/>
-          </w:tcPr>
-          <w:p>
-            <w:pPr>
-              <w:spacing w:before="60" w:after="60"/>
-            </w:pPr>
-            <w:r>
-              <w:rPr>
-                <w:rFonts w:ascii="Arial" w:hAnsi="Arial"/>
-                <w:color w:val="1E293B"/>
-                <w:sz w:val="16"/>
-              </w:rPr>
-              <w:t>14,9 %</w:t>
-            </w:r>
-          </w:p>
-        </w:tc>
-        <w:tc>
-          <w:tcPr>
-            <w:tcW w:type="dxa" w:w="2412"/>
-            <w:shd w:fill="F8FAFC"/>
-          </w:tcPr>
-          <w:p>
-            <w:pPr>
-              <w:spacing w:before="60" w:after="60"/>
-            </w:pPr>
-            <w:r>
-              <w:rPr>
-                <w:rFonts w:ascii="Arial" w:hAnsi="Arial"/>
-                <w:color w:val="1E293B"/>
-                <w:sz w:val="16"/>
-              </w:rPr>
-              <w:t>Direction de projet (2,5j/semaine), suivi des marchés.</w:t>
-            </w:r>
-          </w:p>
-        </w:tc>
-      </w:tr>
-      <w:tr>
-        <w:tc>
-          <w:tcPr>
-            <w:tcW w:type="dxa" w:w="2412"/>
-            <w:shd w:fill="FFFFFF"/>
-          </w:tcPr>
-          <w:p>
-            <w:pPr>
-              <w:spacing w:before="60" w:after="60"/>
-            </w:pPr>
-            <w:r>
-              <w:rPr>
-                <w:rFonts w:ascii="Arial" w:hAnsi="Arial"/>
-                <w:color w:val="1E293B"/>
-                <w:sz w:val="16"/>
-              </w:rPr>
-              <w:t>4. Audit AI Act, Cybersécurité NIS 2 &amp; Éthique</w:t>
-            </w:r>
-          </w:p>
-        </w:tc>
-        <w:tc>
-          <w:tcPr>
-            <w:tcW w:type="dxa" w:w="2412"/>
-            <w:shd w:fill="FFFFFF"/>
-          </w:tcPr>
-          <w:p>
-            <w:pPr>
-              <w:spacing w:before="60" w:after="60"/>
-            </w:pPr>
-            <w:r>
-              <w:rPr>
-                <w:rFonts w:ascii="Arial" w:hAnsi="Arial"/>
-                <w:color w:val="1E293B"/>
-                <w:sz w:val="16"/>
-              </w:rPr>
-              <w:t>60 k€</w:t>
-            </w:r>
-          </w:p>
-        </w:tc>
-        <w:tc>
-          <w:tcPr>
-            <w:tcW w:type="dxa" w:w="2412"/>
-            <w:shd w:fill="FFFFFF"/>
-          </w:tcPr>
-          <w:p>
-            <w:pPr>
-              <w:spacing w:before="60" w:after="60"/>
-            </w:pPr>
-            <w:r>
-              <w:rPr>
-                <w:rFonts w:ascii="Arial" w:hAnsi="Arial"/>
-                <w:color w:val="1E293B"/>
-                <w:sz w:val="16"/>
-              </w:rPr>
-              <w:t>13,8 %</w:t>
-            </w:r>
-          </w:p>
-        </w:tc>
-        <w:tc>
-          <w:tcPr>
-            <w:tcW w:type="dxa" w:w="2412"/>
-            <w:shd w:fill="FFFFFF"/>
-          </w:tcPr>
-          <w:p>
-            <w:pPr>
-              <w:spacing w:before="60" w:after="60"/>
-            </w:pPr>
-            <w:r>
-              <w:rPr>
-                <w:rFonts w:ascii="Arial" w:hAnsi="Arial"/>
-                <w:color w:val="1E293B"/>
-                <w:sz w:val="16"/>
-              </w:rPr>
-              <w:t>Audits de conformité, pentests et secrétariat éthique.</w:t>
-            </w:r>
-          </w:p>
-        </w:tc>
-      </w:tr>
-      <w:tr>
-        <w:tc>
-          <w:tcPr>
-            <w:tcW w:type="dxa" w:w="2412"/>
-            <w:shd w:fill="F8FAFC"/>
-          </w:tcPr>
-          <w:p>
-            <w:pPr>
-              <w:spacing w:before="60" w:after="60"/>
-            </w:pPr>
-            <w:r>
-              <w:rPr>
-                <w:rFonts w:ascii="Arial" w:hAnsi="Arial"/>
-                <w:color w:val="1E293B"/>
-                <w:sz w:val="16"/>
-              </w:rPr>
-              <w:t>5. Concertation &amp; IA Einstein par Quartier</w:t>
-            </w:r>
-          </w:p>
-        </w:tc>
-        <w:tc>
-          <w:tcPr>
-            <w:tcW w:type="dxa" w:w="2412"/>
-            <w:shd w:fill="F8FAFC"/>
-          </w:tcPr>
-          <w:p>
-            <w:pPr>
-              <w:spacing w:before="60" w:after="60"/>
-            </w:pPr>
-            <w:r>
-              <w:rPr>
-                <w:rFonts w:ascii="Arial" w:hAnsi="Arial"/>
-                <w:color w:val="1E293B"/>
-                <w:sz w:val="16"/>
-              </w:rPr>
-              <w:t>40 k€</w:t>
-            </w:r>
-          </w:p>
-        </w:tc>
-        <w:tc>
-          <w:tcPr>
-            <w:tcW w:type="dxa" w:w="2412"/>
-            <w:shd w:fill="F8FAFC"/>
-          </w:tcPr>
-          <w:p>
-            <w:pPr>
-              <w:spacing w:before="60" w:after="60"/>
-            </w:pPr>
-            <w:r>
-              <w:rPr>
-                <w:rFonts w:ascii="Arial" w:hAnsi="Arial"/>
-                <w:color w:val="1E293B"/>
-                <w:sz w:val="16"/>
-              </w:rPr>
-              <w:t>9,2 %</w:t>
-            </w:r>
-          </w:p>
-        </w:tc>
-        <w:tc>
-          <w:tcPr>
-            <w:tcW w:type="dxa" w:w="2412"/>
-            <w:shd w:fill="F8FAFC"/>
-          </w:tcPr>
-          <w:p>
-            <w:pPr>
-              <w:spacing w:before="60" w:after="60"/>
-            </w:pPr>
-            <w:r>
-              <w:rPr>
-                <w:rFonts w:ascii="Arial" w:hAnsi="Arial"/>
-                <w:color w:val="1E293B"/>
-                <w:sz w:val="16"/>
-              </w:rPr>
-              <w:t>Plateforme de démocratie participative augmentée.</w:t>
-            </w:r>
-          </w:p>
-        </w:tc>
-      </w:tr>
-    </w:tbl>
-    <w:p>
-      <w:pPr>
-        <w:spacing w:after="160"/>
-      </w:pPr>
-    </w:p>
-    <w:p>
-      <w:pPr>
-        <w:spacing w:before="160" w:after="280"/>
-        <w:jc w:val="center"/>
-      </w:pPr>
-      <w:r>
-        <w:drawing>
-          <wp:inline xmlns:a="http://schemas.openxmlformats.org/drawingml/2006/main" xmlns:pic="http://schemas.openxmlformats.org/drawingml/2006/picture">
-            <wp:extent cx="5669280" cy="2559050"/>
-            <wp:docPr id="1" name="Picture 1"/>
-            <wp:cNvGraphicFramePr>
-              <a:graphicFrameLocks noChangeAspect="1"/>
-            </wp:cNvGraphicFramePr>
-            <a:graphic>
-              <a:graphicData uri="http://schemas.openxmlformats.org/drawingml/2006/picture">
-                <pic:pic>
-                  <pic:nvPicPr>
-                    <pic:cNvPr id="0" name="chart2_roi_gains.png"/>
-                    <pic:cNvPicPr/>
-                  </pic:nvPicPr>
-                  <pic:blipFill>
-                    <a:blip r:embed="rId9"/>
-                    <a:stretch>
-                      <a:fillRect/>
-                    </a:stretch>
-                  </pic:blipFill>
-                  <pic:spPr>
-                    <a:xfrm>
-                      <a:off x="0" y="0"/>
-                      <a:ext cx="5669280" cy="2559050"/>
-                    </a:xfrm>
-                    <a:prstGeom prst="rect"/>
-                  </pic:spPr>
-                </pic:pic>
-              </a:graphicData>
-            </a:graphic>
-          </wp:inline>
-        </w:drawing>
-      </w:r>
     </w:p>
     <w:p>
       <w:r>
@@ -2421,7 +1836,7 @@
           <w:color w:val="1E3A8A"/>
           <w:sz w:val="25"/>
         </w:rPr>
-        <w:t>1.1 Alignement Institutionnel &amp; Leadership Métropolitain</w:t>
+        <w:t>1.1 Alignement Institutionnel &amp; Leadership</w:t>
       </w:r>
     </w:p>
     <w:p>
@@ -2635,6 +2050,51 @@
           <w:b/>
           <w:color w:val="0F172A"/>
         </w:rPr>
+        <w:t>Sophia c’est ~25,6 % de tous les emplois technopolitains de France.</w:t>
+      </w:r>
+    </w:p>
+    <w:p>
+      <w:pPr>
+        <w:pStyle w:val="ListBullet"/>
+        <w:spacing w:before="40" w:after="100" w:line="276" w:lineRule="auto"/>
+        <w:ind w:left="504"/>
+      </w:pPr>
+      <w:r>
+        <w:rPr>
+          <w:rFonts w:ascii="Arial" w:hAnsi="Arial"/>
+          <w:b/>
+          <w:color w:val="0F172A"/>
+        </w:rPr>
+        <w:t>Sophia c’est ~19,3 % du total des entreprises implantées dans ces structures.</w:t>
+      </w:r>
+    </w:p>
+    <w:p>
+      <w:pPr>
+        <w:pStyle w:val="ListBullet"/>
+        <w:spacing w:before="40" w:after="100" w:line="276" w:lineRule="auto"/>
+        <w:ind w:left="504"/>
+      </w:pPr>
+      <w:r>
+        <w:rPr>
+          <w:rFonts w:ascii="Arial" w:hAnsi="Arial"/>
+          <w:b/>
+          <w:color w:val="0F172A"/>
+        </w:rPr>
+        <w:t>Le terreau azuréen représente seulement 1,66 % de la population Française.</w:t>
+      </w:r>
+    </w:p>
+    <w:p>
+      <w:pPr>
+        <w:pStyle w:val="ListBullet"/>
+        <w:spacing w:before="40" w:after="100" w:line="276" w:lineRule="auto"/>
+        <w:ind w:left="504"/>
+      </w:pPr>
+      <w:r>
+        <w:rPr>
+          <w:rFonts w:ascii="Arial" w:hAnsi="Arial"/>
+          <w:b/>
+          <w:color w:val="0F172A"/>
+        </w:rPr>
         <w:t>Institut 3IA Côte d’Azur &amp; UCA</w:t>
       </w:r>
       <w:r>
@@ -2780,14 +2240,14 @@
     </w:p>
     <w:p>
       <w:pPr>
-        <w:spacing w:before="200" w:after="240"/>
+        <w:spacing w:before="160" w:after="200"/>
         <w:jc w:val="center"/>
       </w:pPr>
       <w:r>
         <w:drawing>
           <wp:inline xmlns:a="http://schemas.openxmlformats.org/drawingml/2006/main" xmlns:pic="http://schemas.openxmlformats.org/drawingml/2006/picture">
-            <wp:extent cx="5669280" cy="1811020"/>
-            <wp:docPr id="2" name="Picture 2"/>
+            <wp:extent cx="5486400" cy="1752600"/>
+            <wp:docPr id="1" name="Picture 1"/>
             <wp:cNvGraphicFramePr>
               <a:graphicFrameLocks noChangeAspect="1"/>
             </wp:cNvGraphicFramePr>
@@ -2799,7 +2259,7 @@
                     <pic:cNvPicPr/>
                   </pic:nvPicPr>
                   <pic:blipFill>
-                    <a:blip r:embed="rId10"/>
+                    <a:blip r:embed="rId9"/>
                     <a:stretch>
                       <a:fillRect/>
                     </a:stretch>
@@ -2807,7 +2267,7 @@
                   <pic:spPr>
                     <a:xfrm>
                       <a:off x="0" y="0"/>
-                      <a:ext cx="5669280" cy="1811020"/>
+                      <a:ext cx="5486400" cy="1752600"/>
                     </a:xfrm>
                     <a:prstGeom prst="rect"/>
                   </pic:spPr>
@@ -2875,7 +2335,7 @@
           <w:rFonts w:ascii="Arial" w:hAnsi="Arial"/>
           <w:color w:val="1E293B"/>
         </w:rPr>
-        <w:t xml:space="preserve"> : Monaco dispose d'un capital et d'un tissu d'entreprises majeurs mais souffre d'une contrainte foncière extrême. L'alliance avec la Métropole Nice Côte d'Azur offre le terrain d'extension économique et technologique indispensable.</w:t>
+        <w:t xml:space="preserve"> : Monaco dispose d'un capital et d'un tissu d'entreprises majeurs mais souffre d'une contrainte foncière extrême. L'alliance avec la Métropole Nice Côte d'Azur offrirait le terrain d'extension économique et technologique indispensable.</w:t>
       </w:r>
     </w:p>
     <w:p>
@@ -2897,7 +2357,7 @@
           <w:rFonts w:ascii="Arial" w:hAnsi="Arial"/>
           <w:color w:val="1E293B"/>
         </w:rPr>
-        <w:t xml:space="preserve"> : Plus de 45 000 salariés traversent chaque jour Nice pour travailler à Monaco (sources INSEE/SCT), constituant un bassin d'emploi unique à irriguer par l'IA.</w:t>
+        <w:t xml:space="preserve"> : Plus de 45 000 salariés traversent chaque jour Nice pour travailler à Monaco (sources INSEE/SCT), constituant un bassin d'emploi unique à irriguer par l'IA. Réduire ces déplacements au quotidien permettra une amélioration de la qualité de vie et une maîtrise des émissions de CO2.</w:t>
       </w:r>
     </w:p>
     <w:p>
@@ -2941,7 +2401,7 @@
           <w:rFonts w:ascii="Arial" w:hAnsi="Arial"/>
           <w:color w:val="1E293B"/>
         </w:rPr>
-        <w:t xml:space="preserve"> : Extrémité d'une « presqu'île électrique » vulnérable (coupure de 2009 ; RTE 2025 saturé), imposant la doctrine de l'IA frugale par nécessité.</w:t>
+        <w:t xml:space="preserve"> : Extrémité d'une « presqu'île électrique » vulnérable (coupure de 2009 ; RTE 2025 saturé), imposing la doctrine de l'IA frugale par nécessité (un data center nécessiterait des investissements RTE très importants).</w:t>
       </w:r>
     </w:p>
     <w:p>
@@ -3046,7 +2506,22 @@
           <w:rFonts w:ascii="Arial" w:hAnsi="Arial"/>
           <w:color w:val="1E293B"/>
         </w:rPr>
-        <w:t xml:space="preserve"> par site pour co-financer un supercalculateur d'IA souverain.</w:t>
+        <w:t xml:space="preserve"> par site pour co-financer le développement de l'IA souverain.</w:t>
+      </w:r>
+    </w:p>
+    <w:p>
+      <w:pPr>
+        <w:pStyle w:val="ListBullet"/>
+        <w:spacing w:before="40" w:after="100" w:line="276" w:lineRule="auto"/>
+        <w:ind w:left="504"/>
+      </w:pPr>
+      <w:r>
+        <w:rPr>
+          <w:rFonts w:ascii="Arial" w:hAnsi="Arial"/>
+          <w:b/>
+          <w:color w:val="0F172A"/>
+        </w:rPr>
+        <w:t>Monaco Cloud est l'opportunité pour développer l'existant.</w:t>
       </w:r>
     </w:p>
     <w:p>
@@ -3246,7 +2721,7 @@
           <w:b/>
           <w:color w:val="0F172A"/>
         </w:rPr>
-        <w:t>4. La Ville client n°1</w:t>
+        <w:t>4. La Ville de Nice et la Métropole client n°1</w:t>
       </w:r>
       <w:r>
         <w:rPr>
@@ -3430,7 +2905,7 @@
           <w:b/>
           <w:color w:val="0F172A"/>
         </w:rPr>
-        <w:t>Résultat certifié</w:t>
+        <w:t>Résultat attendu</w:t>
       </w:r>
       <w:r>
         <w:rPr>
@@ -3579,7 +3054,7 @@
           <w:rFonts w:ascii="Arial" w:hAnsi="Arial"/>
           <w:color w:val="1E293B"/>
         </w:rPr>
-        <w:t xml:space="preserve"> : Traitement instantané de 40 % des appels récurrents, libérant les agents humains pour l'accompagnement social personnalisé et les urgences graves.</w:t>
+        <w:t xml:space="preserve"> : Traitement instantané de 40 % des appels récurrents, libérant les agents humains pour l'accompagnement personnalisé et les urgences graves.</w:t>
       </w:r>
     </w:p>
     <w:p>
@@ -3677,7 +3152,7 @@
           <w:color w:val="1E3A8A"/>
           <w:sz w:val="25"/>
         </w:rPr>
-        <w:t>2.4 Consultation Directe par Quartier via l'IA Einstein</w:t>
+        <w:t>2.4 Consultation Directe par Quartier via l'IA</w:t>
       </w:r>
     </w:p>
     <w:p>
@@ -3699,7 +3174,7 @@
           <w:rFonts w:ascii="Arial" w:hAnsi="Arial"/>
           <w:color w:val="1E293B"/>
         </w:rPr>
-        <w:t xml:space="preserve"> : Déploiement de la plateforme de démocratie participative augmentée par l'</w:t>
+        <w:t xml:space="preserve"> : Déploiement de la plateforme de démocratie participative augmentée par </w:t>
       </w:r>
       <w:r>
         <w:rPr>
@@ -3707,7 +3182,7 @@
           <w:b/>
           <w:color w:val="0F172A"/>
         </w:rPr>
-        <w:t>IA Einstein</w:t>
+        <w:t>l'IA</w:t>
       </w:r>
       <w:r>
         <w:rPr>
@@ -3801,7 +3276,7 @@
           <w:color w:val="0F172A"/>
           <w:sz w:val="30"/>
         </w:rPr>
-        <w:t>3. Pôle 2 : Axe Métropole Nice Côte d'Azur (Budget, Cyber &amp; Monaco)</w:t>
+        <w:t>3. Pôle 2 : Axe Métropole Nice Côte d'Azur (Budget, DSI &amp; Monaco)</w:t>
       </w:r>
     </w:p>
     <w:p>
@@ -3959,7 +3434,7 @@
           <w:b/>
           <w:color w:val="0F172A"/>
         </w:rPr>
-        <w:t>1,8 M€ à 3,0 M€ de sinistre moyen évité par an</w:t>
+        <w:t>1,8 M€ à 3,0 M€ de cout moyen évité par an</w:t>
       </w:r>
       <w:r>
         <w:rPr>
@@ -4378,6 +3853,110 @@
       </w:r>
     </w:p>
     <w:p>
+      <w:pPr>
+        <w:pStyle w:val="Heading2"/>
+        <w:keepNext/>
+        <w:spacing w:before="280" w:after="120"/>
+      </w:pPr>
+      <w:r>
+        <w:rPr>
+          <w:rFonts w:ascii="Georgia" w:hAnsi="Georgia"/>
+          <w:b/>
+          <w:color w:val="1E3A8A"/>
+          <w:sz w:val="25"/>
+        </w:rPr>
+        <w:t>4.4 Pôle d'Excellence pour les Niçoises et les Niçois</w:t>
+      </w:r>
+    </w:p>
+    <w:p>
+      <w:pPr>
+        <w:pStyle w:val="ListBullet"/>
+        <w:spacing w:before="40" w:after="100" w:line="276" w:lineRule="auto"/>
+        <w:ind w:left="504"/>
+      </w:pPr>
+      <w:r>
+        <w:rPr>
+          <w:rFonts w:ascii="Arial" w:hAnsi="Arial"/>
+          <w:b/>
+          <w:color w:val="0F172A"/>
+        </w:rPr>
+        <w:t>Acculturation &amp; Formations Gratuites dans les AnimaNice</w:t>
+      </w:r>
+      <w:r>
+        <w:rPr>
+          <w:rFonts w:ascii="Arial" w:hAnsi="Arial"/>
+          <w:color w:val="1E293B"/>
+        </w:rPr>
+        <w:t xml:space="preserve"> : Déploiement d'ateliers hebdomadaires d'initiation et de maîtrise de l'IA pour les séniors, les familles et les jeunes au sein de l'ensemble du réseau des centres AnimaNice (Vieux-Nice, Ariane, Cimiez, Fabron, Riquier, etc.).</w:t>
+      </w:r>
+    </w:p>
+    <w:p>
+      <w:pPr>
+        <w:pStyle w:val="ListBullet"/>
+        <w:spacing w:before="40" w:after="100" w:line="276" w:lineRule="auto"/>
+        <w:ind w:left="504"/>
+      </w:pPr>
+      <w:r>
+        <w:rPr>
+          <w:rFonts w:ascii="Arial" w:hAnsi="Arial"/>
+          <w:b/>
+          <w:color w:val="0F172A"/>
+        </w:rPr>
+        <w:t>Charte d'Éthique &amp; Protection Absolue des Données Personnelles</w:t>
+      </w:r>
+      <w:r>
+        <w:rPr>
+          <w:rFonts w:ascii="Arial" w:hAnsi="Arial"/>
+          <w:color w:val="1E293B"/>
+        </w:rPr>
+        <w:t xml:space="preserve"> : Sanctification de la vie privée des Niçois. Aucune donnée citoyenne ou image vidéo n'est commercialisée ni stockée hors des serveurs souverains sous souveraineté exclusive (Monaco Cloud AMSN / Air-Gap Métropolitain).</w:t>
+      </w:r>
+    </w:p>
+    <w:p>
+      <w:pPr>
+        <w:pStyle w:val="ListBullet"/>
+        <w:spacing w:before="40" w:after="100" w:line="276" w:lineRule="auto"/>
+        <w:ind w:left="504"/>
+      </w:pPr>
+      <w:r>
+        <w:rPr>
+          <w:rFonts w:ascii="Arial" w:hAnsi="Arial"/>
+          <w:b/>
+          <w:color w:val="0F172A"/>
+        </w:rPr>
+        <w:t>Pass IA Jeunesse &amp; Accompagnement Éducatif</w:t>
+      </w:r>
+      <w:r>
+        <w:rPr>
+          <w:rFonts w:ascii="Arial" w:hAnsi="Arial"/>
+          <w:color w:val="1E293B"/>
+        </w:rPr>
+        <w:t xml:space="preserve"> : Partenariat avec l'Université Côte d'Azur pour mettre à disposition des étudiants, lycéens et collégiens niçois des accès souverains gratuits aux outils de recherche et d'ingénierie IA.</w:t>
+      </w:r>
+    </w:p>
+    <w:p>
+      <w:pPr>
+        <w:pStyle w:val="ListBullet"/>
+        <w:spacing w:before="40" w:after="100" w:line="276" w:lineRule="auto"/>
+        <w:ind w:left="504"/>
+      </w:pPr>
+      <w:r>
+        <w:rPr>
+          <w:rFonts w:ascii="Arial" w:hAnsi="Arial"/>
+          <w:b/>
+          <w:color w:val="0F172A"/>
+        </w:rPr>
+        <w:t>Transparence &amp; Gouvernance Citoyenne</w:t>
+      </w:r>
+      <w:r>
+        <w:rPr>
+          <w:rFonts w:ascii="Arial" w:hAnsi="Arial"/>
+          <w:color w:val="1E293B"/>
+        </w:rPr>
+        <w:t xml:space="preserve"> : Publication annuelle d'un bilan d'impact éthique et financier de l'IA municipale, librement accessible à tous les citoyens niçois.</w:t>
+      </w:r>
+    </w:p>
+    <w:p>
       <w:r>
         <w:br w:type="page"/>
       </w:r>
@@ -4411,7 +3990,7 @@
           <w:color w:val="1E3A8A"/>
           <w:sz w:val="25"/>
         </w:rPr>
-        <w:t>5.1 Présidence Éric Ciotti &amp; Direction Benoît SIGWALD (2,5j/sem)</w:t>
+        <w:t>5.1 Présidence Éric Ciotti</w:t>
       </w:r>
     </w:p>
     <w:p>
@@ -4500,52 +4079,7 @@
           <w:rFonts w:ascii="Arial" w:hAnsi="Arial"/>
           <w:color w:val="1E293B"/>
         </w:rPr>
-        <w:t xml:space="preserve">, réduisant la ligne AMO à </w:t>
-      </w:r>
-      <w:r>
-        <w:rPr>
-          <w:rFonts w:ascii="Arial" w:hAnsi="Arial"/>
-          <w:b/>
-          <w:color w:val="0F172A"/>
-        </w:rPr>
-        <w:t>65 k€ / an</w:t>
-      </w:r>
-      <w:r>
-        <w:rPr>
-          <w:rFonts w:ascii="Arial" w:hAnsi="Arial"/>
-          <w:color w:val="1E293B"/>
-        </w:rPr>
-        <w:t xml:space="preserve"> et amenant le budget global à </w:t>
-      </w:r>
-      <w:r>
-        <w:rPr>
-          <w:rFonts w:ascii="Arial" w:hAnsi="Arial"/>
-          <w:b/>
-          <w:color w:val="0F172A"/>
-        </w:rPr>
-        <w:t>435 k€ / an</w:t>
-      </w:r>
-      <w:r>
-        <w:rPr>
-          <w:rFonts w:ascii="Arial" w:hAnsi="Arial"/>
-          <w:color w:val="1E293B"/>
-        </w:rPr>
-        <w:t xml:space="preserve"> (reste à charge net métropolitain : </w:t>
-      </w:r>
-      <w:r>
-        <w:rPr>
-          <w:rFonts w:ascii="Arial" w:hAnsi="Arial"/>
-          <w:b/>
-          <w:color w:val="0F172A"/>
-        </w:rPr>
-        <w:t>~217 k€ / an</w:t>
-      </w:r>
-      <w:r>
-        <w:rPr>
-          <w:rFonts w:ascii="Arial" w:hAnsi="Arial"/>
-          <w:color w:val="1E293B"/>
-        </w:rPr>
-        <w:t>).</w:t>
+        <w:t>.</w:t>
       </w:r>
     </w:p>
     <w:p>
@@ -4571,15 +4105,15 @@
         <w:tblLook w:firstColumn="1" w:firstRow="1" w:lastColumn="0" w:lastRow="0" w:noHBand="0" w:noVBand="1" w:val="04A0"/>
       </w:tblPr>
       <w:tblGrid>
-        <w:gridCol w:w="2412"/>
-        <w:gridCol w:w="2412"/>
-        <w:gridCol w:w="2412"/>
-        <w:gridCol w:w="2412"/>
+        <w:gridCol w:w="2448"/>
+        <w:gridCol w:w="2448"/>
+        <w:gridCol w:w="2448"/>
+        <w:gridCol w:w="2448"/>
       </w:tblGrid>
       <w:tr>
         <w:tc>
           <w:tcPr>
-            <w:tcW w:type="dxa" w:w="2412"/>
+            <w:tcW w:type="dxa" w:w="2448"/>
             <w:shd w:fill="1E293B"/>
           </w:tcPr>
           <w:p>
@@ -4599,7 +4133,7 @@
         </w:tc>
         <w:tc>
           <w:tcPr>
-            <w:tcW w:type="dxa" w:w="2412"/>
+            <w:tcW w:type="dxa" w:w="2448"/>
             <w:shd w:fill="1E293B"/>
           </w:tcPr>
           <w:p>
@@ -4619,7 +4153,7 @@
         </w:tc>
         <w:tc>
           <w:tcPr>
-            <w:tcW w:type="dxa" w:w="2412"/>
+            <w:tcW w:type="dxa" w:w="2448"/>
             <w:shd w:fill="1E293B"/>
           </w:tcPr>
           <w:p>
@@ -4639,7 +4173,7 @@
         </w:tc>
         <w:tc>
           <w:tcPr>
-            <w:tcW w:type="dxa" w:w="2412"/>
+            <w:tcW w:type="dxa" w:w="2448"/>
             <w:shd w:fill="1E293B"/>
           </w:tcPr>
           <w:p>
@@ -4661,7 +4195,7 @@
       <w:tr>
         <w:tc>
           <w:tcPr>
-            <w:tcW w:type="dxa" w:w="2412"/>
+            <w:tcW w:type="dxa" w:w="2448"/>
             <w:shd w:fill="F8FAFC"/>
           </w:tcPr>
           <w:p>
@@ -4680,7 +4214,7 @@
         </w:tc>
         <w:tc>
           <w:tcPr>
-            <w:tcW w:type="dxa" w:w="2412"/>
+            <w:tcW w:type="dxa" w:w="2448"/>
             <w:shd w:fill="F8FAFC"/>
           </w:tcPr>
           <w:p>
@@ -4699,7 +4233,7 @@
         </w:tc>
         <w:tc>
           <w:tcPr>
-            <w:tcW w:type="dxa" w:w="2412"/>
+            <w:tcW w:type="dxa" w:w="2448"/>
             <w:shd w:fill="F8FAFC"/>
           </w:tcPr>
           <w:p>
@@ -4718,7 +4252,7 @@
         </w:tc>
         <w:tc>
           <w:tcPr>
-            <w:tcW w:type="dxa" w:w="2412"/>
+            <w:tcW w:type="dxa" w:w="2448"/>
             <w:shd w:fill="F8FAFC"/>
           </w:tcPr>
           <w:p>
@@ -4739,7 +4273,7 @@
       <w:tr>
         <w:tc>
           <w:tcPr>
-            <w:tcW w:type="dxa" w:w="2412"/>
+            <w:tcW w:type="dxa" w:w="2448"/>
             <w:shd w:fill="FFFFFF"/>
           </w:tcPr>
           <w:p>
@@ -4758,7 +4292,7 @@
         </w:tc>
         <w:tc>
           <w:tcPr>
-            <w:tcW w:type="dxa" w:w="2412"/>
+            <w:tcW w:type="dxa" w:w="2448"/>
             <w:shd w:fill="FFFFFF"/>
           </w:tcPr>
           <w:p>
@@ -4777,7 +4311,7 @@
         </w:tc>
         <w:tc>
           <w:tcPr>
-            <w:tcW w:type="dxa" w:w="2412"/>
+            <w:tcW w:type="dxa" w:w="2448"/>
             <w:shd w:fill="FFFFFF"/>
           </w:tcPr>
           <w:p>
@@ -4796,7 +4330,7 @@
         </w:tc>
         <w:tc>
           <w:tcPr>
-            <w:tcW w:type="dxa" w:w="2412"/>
+            <w:tcW w:type="dxa" w:w="2448"/>
             <w:shd w:fill="FFFFFF"/>
           </w:tcPr>
           <w:p>
@@ -4817,7 +4351,7 @@
       <w:tr>
         <w:tc>
           <w:tcPr>
-            <w:tcW w:type="dxa" w:w="2412"/>
+            <w:tcW w:type="dxa" w:w="2448"/>
             <w:shd w:fill="F8FAFC"/>
           </w:tcPr>
           <w:p>
@@ -4836,7 +4370,7 @@
         </w:tc>
         <w:tc>
           <w:tcPr>
-            <w:tcW w:type="dxa" w:w="2412"/>
+            <w:tcW w:type="dxa" w:w="2448"/>
             <w:shd w:fill="F8FAFC"/>
           </w:tcPr>
           <w:p>
@@ -4855,7 +4389,7 @@
         </w:tc>
         <w:tc>
           <w:tcPr>
-            <w:tcW w:type="dxa" w:w="2412"/>
+            <w:tcW w:type="dxa" w:w="2448"/>
             <w:shd w:fill="F8FAFC"/>
           </w:tcPr>
           <w:p>
@@ -4874,7 +4408,7 @@
         </w:tc>
         <w:tc>
           <w:tcPr>
-            <w:tcW w:type="dxa" w:w="2412"/>
+            <w:tcW w:type="dxa" w:w="2448"/>
             <w:shd w:fill="F8FAFC"/>
           </w:tcPr>
           <w:p>
@@ -4895,7 +4429,7 @@
       <w:tr>
         <w:tc>
           <w:tcPr>
-            <w:tcW w:type="dxa" w:w="2412"/>
+            <w:tcW w:type="dxa" w:w="2448"/>
             <w:shd w:fill="FFFFFF"/>
           </w:tcPr>
           <w:p>
@@ -4914,7 +4448,7 @@
         </w:tc>
         <w:tc>
           <w:tcPr>
-            <w:tcW w:type="dxa" w:w="2412"/>
+            <w:tcW w:type="dxa" w:w="2448"/>
             <w:shd w:fill="FFFFFF"/>
           </w:tcPr>
           <w:p>
@@ -4933,7 +4467,7 @@
         </w:tc>
         <w:tc>
           <w:tcPr>
-            <w:tcW w:type="dxa" w:w="2412"/>
+            <w:tcW w:type="dxa" w:w="2448"/>
             <w:shd w:fill="FFFFFF"/>
           </w:tcPr>
           <w:p>
@@ -4952,7 +4486,7 @@
         </w:tc>
         <w:tc>
           <w:tcPr>
-            <w:tcW w:type="dxa" w:w="2412"/>
+            <w:tcW w:type="dxa" w:w="2448"/>
             <w:shd w:fill="FFFFFF"/>
           </w:tcPr>
           <w:p>
@@ -4973,7 +4507,7 @@
       <w:tr>
         <w:tc>
           <w:tcPr>
-            <w:tcW w:type="dxa" w:w="2412"/>
+            <w:tcW w:type="dxa" w:w="2448"/>
             <w:shd w:fill="F8FAFC"/>
           </w:tcPr>
           <w:p>
@@ -4992,7 +4526,7 @@
         </w:tc>
         <w:tc>
           <w:tcPr>
-            <w:tcW w:type="dxa" w:w="2412"/>
+            <w:tcW w:type="dxa" w:w="2448"/>
             <w:shd w:fill="F8FAFC"/>
           </w:tcPr>
           <w:p>
@@ -5011,7 +4545,7 @@
         </w:tc>
         <w:tc>
           <w:tcPr>
-            <w:tcW w:type="dxa" w:w="2412"/>
+            <w:tcW w:type="dxa" w:w="2448"/>
             <w:shd w:fill="F8FAFC"/>
           </w:tcPr>
           <w:p>
@@ -5030,7 +4564,7 @@
         </w:tc>
         <w:tc>
           <w:tcPr>
-            <w:tcW w:type="dxa" w:w="2412"/>
+            <w:tcW w:type="dxa" w:w="2448"/>
             <w:shd w:fill="F8FAFC"/>
           </w:tcPr>
           <w:p>
@@ -5051,7 +4585,7 @@
       <w:tr>
         <w:tc>
           <w:tcPr>
-            <w:tcW w:type="dxa" w:w="2412"/>
+            <w:tcW w:type="dxa" w:w="2448"/>
             <w:shd w:fill="FFFFFF"/>
           </w:tcPr>
           <w:p>
@@ -5070,7 +4604,7 @@
         </w:tc>
         <w:tc>
           <w:tcPr>
-            <w:tcW w:type="dxa" w:w="2412"/>
+            <w:tcW w:type="dxa" w:w="2448"/>
             <w:shd w:fill="FFFFFF"/>
           </w:tcPr>
           <w:p>
@@ -5089,7 +4623,7 @@
         </w:tc>
         <w:tc>
           <w:tcPr>
-            <w:tcW w:type="dxa" w:w="2412"/>
+            <w:tcW w:type="dxa" w:w="2448"/>
             <w:shd w:fill="FFFFFF"/>
           </w:tcPr>
           <w:p>
@@ -5108,7 +4642,7 @@
         </w:tc>
         <w:tc>
           <w:tcPr>
-            <w:tcW w:type="dxa" w:w="2412"/>
+            <w:tcW w:type="dxa" w:w="2448"/>
             <w:shd w:fill="FFFFFF"/>
           </w:tcPr>
           <w:p>
@@ -5129,7 +4663,7 @@
       <w:tr>
         <w:tc>
           <w:tcPr>
-            <w:tcW w:type="dxa" w:w="2412"/>
+            <w:tcW w:type="dxa" w:w="2448"/>
             <w:shd w:fill="F8FAFC"/>
           </w:tcPr>
           <w:p>
@@ -5148,7 +4682,7 @@
         </w:tc>
         <w:tc>
           <w:tcPr>
-            <w:tcW w:type="dxa" w:w="2412"/>
+            <w:tcW w:type="dxa" w:w="2448"/>
             <w:shd w:fill="F8FAFC"/>
           </w:tcPr>
           <w:p>
@@ -5167,7 +4701,7 @@
         </w:tc>
         <w:tc>
           <w:tcPr>
-            <w:tcW w:type="dxa" w:w="2412"/>
+            <w:tcW w:type="dxa" w:w="2448"/>
             <w:shd w:fill="F8FAFC"/>
           </w:tcPr>
           <w:p>
@@ -5186,7 +4720,7 @@
         </w:tc>
         <w:tc>
           <w:tcPr>
-            <w:tcW w:type="dxa" w:w="2412"/>
+            <w:tcW w:type="dxa" w:w="2448"/>
             <w:shd w:fill="F8FAFC"/>
           </w:tcPr>
           <w:p>
@@ -5207,7 +4741,7 @@
       <w:tr>
         <w:tc>
           <w:tcPr>
-            <w:tcW w:type="dxa" w:w="2412"/>
+            <w:tcW w:type="dxa" w:w="2448"/>
             <w:shd w:fill="FFFFFF"/>
           </w:tcPr>
           <w:p>
@@ -5226,7 +4760,7 @@
         </w:tc>
         <w:tc>
           <w:tcPr>
-            <w:tcW w:type="dxa" w:w="2412"/>
+            <w:tcW w:type="dxa" w:w="2448"/>
             <w:shd w:fill="FFFFFF"/>
           </w:tcPr>
           <w:p>
@@ -5245,7 +4779,7 @@
         </w:tc>
         <w:tc>
           <w:tcPr>
-            <w:tcW w:type="dxa" w:w="2412"/>
+            <w:tcW w:type="dxa" w:w="2448"/>
             <w:shd w:fill="FFFFFF"/>
           </w:tcPr>
           <w:p>
@@ -5264,7 +4798,7 @@
         </w:tc>
         <w:tc>
           <w:tcPr>
-            <w:tcW w:type="dxa" w:w="2412"/>
+            <w:tcW w:type="dxa" w:w="2448"/>
             <w:shd w:fill="FFFFFF"/>
           </w:tcPr>
           <w:p>
@@ -5285,7 +4819,7 @@
       <w:tr>
         <w:tc>
           <w:tcPr>
-            <w:tcW w:type="dxa" w:w="2412"/>
+            <w:tcW w:type="dxa" w:w="2448"/>
             <w:shd w:fill="F8FAFC"/>
           </w:tcPr>
           <w:p>
@@ -5304,7 +4838,7 @@
         </w:tc>
         <w:tc>
           <w:tcPr>
-            <w:tcW w:type="dxa" w:w="2412"/>
+            <w:tcW w:type="dxa" w:w="2448"/>
             <w:shd w:fill="F8FAFC"/>
           </w:tcPr>
           <w:p>
@@ -5323,7 +4857,7 @@
         </w:tc>
         <w:tc>
           <w:tcPr>
-            <w:tcW w:type="dxa" w:w="2412"/>
+            <w:tcW w:type="dxa" w:w="2448"/>
             <w:shd w:fill="F8FAFC"/>
           </w:tcPr>
           <w:p>
@@ -5342,7 +4876,7 @@
         </w:tc>
         <w:tc>
           <w:tcPr>
-            <w:tcW w:type="dxa" w:w="2412"/>
+            <w:tcW w:type="dxa" w:w="2448"/>
             <w:shd w:fill="F8FAFC"/>
           </w:tcPr>
           <w:p>
@@ -5363,7 +4897,7 @@
       <w:tr>
         <w:tc>
           <w:tcPr>
-            <w:tcW w:type="dxa" w:w="2412"/>
+            <w:tcW w:type="dxa" w:w="2448"/>
             <w:shd w:fill="FFFFFF"/>
           </w:tcPr>
           <w:p>
@@ -5382,7 +4916,7 @@
         </w:tc>
         <w:tc>
           <w:tcPr>
-            <w:tcW w:type="dxa" w:w="2412"/>
+            <w:tcW w:type="dxa" w:w="2448"/>
             <w:shd w:fill="FFFFFF"/>
           </w:tcPr>
           <w:p>
@@ -5401,7 +4935,7 @@
         </w:tc>
         <w:tc>
           <w:tcPr>
-            <w:tcW w:type="dxa" w:w="2412"/>
+            <w:tcW w:type="dxa" w:w="2448"/>
             <w:shd w:fill="FFFFFF"/>
           </w:tcPr>
           <w:p>
@@ -5420,7 +4954,7 @@
         </w:tc>
         <w:tc>
           <w:tcPr>
-            <w:tcW w:type="dxa" w:w="2412"/>
+            <w:tcW w:type="dxa" w:w="2448"/>
             <w:shd w:fill="FFFFFF"/>
           </w:tcPr>
           <w:p>
@@ -5441,7 +4975,7 @@
       <w:tr>
         <w:tc>
           <w:tcPr>
-            <w:tcW w:type="dxa" w:w="2412"/>
+            <w:tcW w:type="dxa" w:w="2448"/>
             <w:shd w:fill="F8FAFC"/>
           </w:tcPr>
           <w:p>
@@ -5460,7 +4994,7 @@
         </w:tc>
         <w:tc>
           <w:tcPr>
-            <w:tcW w:type="dxa" w:w="2412"/>
+            <w:tcW w:type="dxa" w:w="2448"/>
             <w:shd w:fill="F8FAFC"/>
           </w:tcPr>
           <w:p>
@@ -5479,7 +5013,7 @@
         </w:tc>
         <w:tc>
           <w:tcPr>
-            <w:tcW w:type="dxa" w:w="2412"/>
+            <w:tcW w:type="dxa" w:w="2448"/>
             <w:shd w:fill="F8FAFC"/>
           </w:tcPr>
           <w:p>
@@ -5498,7 +5032,7 @@
         </w:tc>
         <w:tc>
           <w:tcPr>
-            <w:tcW w:type="dxa" w:w="2412"/>
+            <w:tcW w:type="dxa" w:w="2448"/>
             <w:shd w:fill="F8FAFC"/>
           </w:tcPr>
           <w:p>
@@ -5519,7 +5053,7 @@
       <w:tr>
         <w:tc>
           <w:tcPr>
-            <w:tcW w:type="dxa" w:w="2412"/>
+            <w:tcW w:type="dxa" w:w="2448"/>
             <w:shd w:fill="FFFFFF"/>
           </w:tcPr>
           <w:p>
@@ -5538,7 +5072,7 @@
         </w:tc>
         <w:tc>
           <w:tcPr>
-            <w:tcW w:type="dxa" w:w="2412"/>
+            <w:tcW w:type="dxa" w:w="2448"/>
             <w:shd w:fill="FFFFFF"/>
           </w:tcPr>
           <w:p>
@@ -5557,7 +5091,7 @@
         </w:tc>
         <w:tc>
           <w:tcPr>
-            <w:tcW w:type="dxa" w:w="2412"/>
+            <w:tcW w:type="dxa" w:w="2448"/>
             <w:shd w:fill="FFFFFF"/>
           </w:tcPr>
           <w:p>
@@ -5576,7 +5110,7 @@
         </w:tc>
         <w:tc>
           <w:tcPr>
-            <w:tcW w:type="dxa" w:w="2412"/>
+            <w:tcW w:type="dxa" w:w="2448"/>
             <w:shd w:fill="FFFFFF"/>
           </w:tcPr>
           <w:p>
@@ -5597,7 +5131,7 @@
       <w:tr>
         <w:tc>
           <w:tcPr>
-            <w:tcW w:type="dxa" w:w="2412"/>
+            <w:tcW w:type="dxa" w:w="2448"/>
             <w:shd w:fill="F8FAFC"/>
           </w:tcPr>
           <w:p>
@@ -5616,7 +5150,7 @@
         </w:tc>
         <w:tc>
           <w:tcPr>
-            <w:tcW w:type="dxa" w:w="2412"/>
+            <w:tcW w:type="dxa" w:w="2448"/>
             <w:shd w:fill="F8FAFC"/>
           </w:tcPr>
           <w:p>
@@ -5635,7 +5169,7 @@
         </w:tc>
         <w:tc>
           <w:tcPr>
-            <w:tcW w:type="dxa" w:w="2412"/>
+            <w:tcW w:type="dxa" w:w="2448"/>
             <w:shd w:fill="F8FAFC"/>
           </w:tcPr>
           <w:p>
@@ -5654,7 +5188,7 @@
         </w:tc>
         <w:tc>
           <w:tcPr>
-            <w:tcW w:type="dxa" w:w="2412"/>
+            <w:tcW w:type="dxa" w:w="2448"/>
             <w:shd w:fill="F8FAFC"/>
           </w:tcPr>
           <w:p>
@@ -5675,7 +5209,7 @@
       <w:tr>
         <w:tc>
           <w:tcPr>
-            <w:tcW w:type="dxa" w:w="2412"/>
+            <w:tcW w:type="dxa" w:w="2448"/>
             <w:shd w:fill="FFFFFF"/>
           </w:tcPr>
           <w:p>
@@ -5694,7 +5228,7 @@
         </w:tc>
         <w:tc>
           <w:tcPr>
-            <w:tcW w:type="dxa" w:w="2412"/>
+            <w:tcW w:type="dxa" w:w="2448"/>
             <w:shd w:fill="FFFFFF"/>
           </w:tcPr>
           <w:p>
@@ -5707,13 +5241,13 @@
                 <w:color w:val="1E293B"/>
                 <w:sz w:val="16"/>
               </w:rPr>
-              <w:t>L4.3 Bilan Année 1 &amp; Arbitrages Citoyens</w:t>
+              <w:t>L4.3 Bilan Année 1 &amp; Pôle Citoyens AnimaNice</w:t>
             </w:r>
           </w:p>
         </w:tc>
         <w:tc>
           <w:tcPr>
-            <w:tcW w:type="dxa" w:w="2412"/>
+            <w:tcW w:type="dxa" w:w="2448"/>
             <w:shd w:fill="FFFFFF"/>
           </w:tcPr>
           <w:p>
@@ -5732,7 +5266,7 @@
         </w:tc>
         <w:tc>
           <w:tcPr>
-            <w:tcW w:type="dxa" w:w="2412"/>
+            <w:tcW w:type="dxa" w:w="2448"/>
             <w:shd w:fill="FFFFFF"/>
           </w:tcPr>
           <w:p>
@@ -5753,7 +5287,7 @@
       <w:tr>
         <w:tc>
           <w:tcPr>
-            <w:tcW w:type="dxa" w:w="2412"/>
+            <w:tcW w:type="dxa" w:w="2448"/>
             <w:shd w:fill="F8FAFC"/>
           </w:tcPr>
           <w:p>
@@ -5772,7 +5306,7 @@
         </w:tc>
         <w:tc>
           <w:tcPr>
-            <w:tcW w:type="dxa" w:w="2412"/>
+            <w:tcW w:type="dxa" w:w="2448"/>
             <w:shd w:fill="F8FAFC"/>
           </w:tcPr>
           <w:p>
@@ -5791,7 +5325,7 @@
         </w:tc>
         <w:tc>
           <w:tcPr>
-            <w:tcW w:type="dxa" w:w="2412"/>
+            <w:tcW w:type="dxa" w:w="2448"/>
             <w:shd w:fill="F8FAFC"/>
           </w:tcPr>
           <w:p>
@@ -5810,7 +5344,7 @@
         </w:tc>
         <w:tc>
           <w:tcPr>
-            <w:tcW w:type="dxa" w:w="2412"/>
+            <w:tcW w:type="dxa" w:w="2448"/>
             <w:shd w:fill="F8FAFC"/>
           </w:tcPr>
           <w:p>
@@ -5831,7 +5365,7 @@
       <w:tr>
         <w:tc>
           <w:tcPr>
-            <w:tcW w:type="dxa" w:w="2412"/>
+            <w:tcW w:type="dxa" w:w="2448"/>
             <w:shd w:fill="FFFFFF"/>
           </w:tcPr>
           <w:p>
@@ -5850,7 +5384,7 @@
         </w:tc>
         <w:tc>
           <w:tcPr>
-            <w:tcW w:type="dxa" w:w="2412"/>
+            <w:tcW w:type="dxa" w:w="2448"/>
             <w:shd w:fill="FFFFFF"/>
           </w:tcPr>
           <w:p>
@@ -5869,7 +5403,7 @@
         </w:tc>
         <w:tc>
           <w:tcPr>
-            <w:tcW w:type="dxa" w:w="2412"/>
+            <w:tcW w:type="dxa" w:w="2448"/>
             <w:shd w:fill="FFFFFF"/>
           </w:tcPr>
           <w:p>
@@ -5888,7 +5422,7 @@
         </w:tc>
         <w:tc>
           <w:tcPr>
-            <w:tcW w:type="dxa" w:w="2412"/>
+            <w:tcW w:type="dxa" w:w="2448"/>
             <w:shd w:fill="FFFFFF"/>
           </w:tcPr>
           <w:p>
@@ -5909,7 +5443,7 @@
       <w:tr>
         <w:tc>
           <w:tcPr>
-            <w:tcW w:type="dxa" w:w="2412"/>
+            <w:tcW w:type="dxa" w:w="2448"/>
             <w:shd w:fill="F8FAFC"/>
           </w:tcPr>
           <w:p>
@@ -5928,7 +5462,7 @@
         </w:tc>
         <w:tc>
           <w:tcPr>
-            <w:tcW w:type="dxa" w:w="2412"/>
+            <w:tcW w:type="dxa" w:w="2448"/>
             <w:shd w:fill="F8FAFC"/>
           </w:tcPr>
           <w:p>
@@ -5947,7 +5481,7 @@
         </w:tc>
         <w:tc>
           <w:tcPr>
-            <w:tcW w:type="dxa" w:w="2412"/>
+            <w:tcW w:type="dxa" w:w="2448"/>
             <w:shd w:fill="F8FAFC"/>
           </w:tcPr>
           <w:p>
@@ -5966,7 +5500,7 @@
         </w:tc>
         <w:tc>
           <w:tcPr>
-            <w:tcW w:type="dxa" w:w="2412"/>
+            <w:tcW w:type="dxa" w:w="2448"/>
             <w:shd w:fill="F8FAFC"/>
           </w:tcPr>
           <w:p>
@@ -5987,7 +5521,7 @@
       <w:tr>
         <w:tc>
           <w:tcPr>
-            <w:tcW w:type="dxa" w:w="2412"/>
+            <w:tcW w:type="dxa" w:w="2448"/>
             <w:shd w:fill="FFFFFF"/>
           </w:tcPr>
           <w:p>
@@ -6006,7 +5540,7 @@
         </w:tc>
         <w:tc>
           <w:tcPr>
-            <w:tcW w:type="dxa" w:w="2412"/>
+            <w:tcW w:type="dxa" w:w="2448"/>
             <w:shd w:fill="FFFFFF"/>
           </w:tcPr>
           <w:p>
@@ -6025,7 +5559,7 @@
         </w:tc>
         <w:tc>
           <w:tcPr>
-            <w:tcW w:type="dxa" w:w="2412"/>
+            <w:tcW w:type="dxa" w:w="2448"/>
             <w:shd w:fill="FFFFFF"/>
           </w:tcPr>
           <w:p>
@@ -6044,7 +5578,7 @@
         </w:tc>
         <w:tc>
           <w:tcPr>
-            <w:tcW w:type="dxa" w:w="2412"/>
+            <w:tcW w:type="dxa" w:w="2448"/>
             <w:shd w:fill="FFFFFF"/>
           </w:tcPr>
           <w:p>
@@ -6065,7 +5599,7 @@
       <w:tr>
         <w:tc>
           <w:tcPr>
-            <w:tcW w:type="dxa" w:w="2412"/>
+            <w:tcW w:type="dxa" w:w="2448"/>
             <w:shd w:fill="F8FAFC"/>
           </w:tcPr>
           <w:p>
@@ -6084,7 +5618,7 @@
         </w:tc>
         <w:tc>
           <w:tcPr>
-            <w:tcW w:type="dxa" w:w="2412"/>
+            <w:tcW w:type="dxa" w:w="2448"/>
             <w:shd w:fill="F8FAFC"/>
           </w:tcPr>
           <w:p>
@@ -6103,7 +5637,7 @@
         </w:tc>
         <w:tc>
           <w:tcPr>
-            <w:tcW w:type="dxa" w:w="2412"/>
+            <w:tcW w:type="dxa" w:w="2448"/>
             <w:shd w:fill="F8FAFC"/>
           </w:tcPr>
           <w:p>
@@ -6122,7 +5656,7 @@
         </w:tc>
         <w:tc>
           <w:tcPr>
-            <w:tcW w:type="dxa" w:w="2412"/>
+            <w:tcW w:type="dxa" w:w="2448"/>
             <w:shd w:fill="F8FAFC"/>
           </w:tcPr>
           <w:p>
@@ -6143,7 +5677,7 @@
       <w:tr>
         <w:tc>
           <w:tcPr>
-            <w:tcW w:type="dxa" w:w="2412"/>
+            <w:tcW w:type="dxa" w:w="2448"/>
             <w:shd w:fill="FFFFFF"/>
           </w:tcPr>
           <w:p>
@@ -6162,7 +5696,7 @@
         </w:tc>
         <w:tc>
           <w:tcPr>
-            <w:tcW w:type="dxa" w:w="2412"/>
+            <w:tcW w:type="dxa" w:w="2448"/>
             <w:shd w:fill="FFFFFF"/>
           </w:tcPr>
           <w:p>
@@ -6181,7 +5715,7 @@
         </w:tc>
         <w:tc>
           <w:tcPr>
-            <w:tcW w:type="dxa" w:w="2412"/>
+            <w:tcW w:type="dxa" w:w="2448"/>
             <w:shd w:fill="FFFFFF"/>
           </w:tcPr>
           <w:p>
@@ -6200,7 +5734,7 @@
         </w:tc>
         <w:tc>
           <w:tcPr>
-            <w:tcW w:type="dxa" w:w="2412"/>
+            <w:tcW w:type="dxa" w:w="2448"/>
             <w:shd w:fill="FFFFFF"/>
           </w:tcPr>
           <w:p>
@@ -6237,7 +5771,7 @@
           <w:color w:val="1E3A8A"/>
           <w:sz w:val="25"/>
         </w:rPr>
-        <w:t>5.3 Résumé Consolidé du Coût par Année Budgétaire</w:t>
+        <w:t>5.3 Résumé Consolidé du Coût par Axe Institutionnel (Mairie, Métropole, Monaco)</w:t>
       </w:r>
     </w:p>
     <w:p>
@@ -6252,14 +5786,14 @@
           <w:b/>
           <w:color w:val="0F172A"/>
         </w:rPr>
-        <w:t>Rendement Budgétaire Net</w:t>
+        <w:t>Structure Budgétaire Simplifiée par Entité</w:t>
       </w:r>
       <w:r>
         <w:rPr>
           <w:rFonts w:ascii="Arial" w:hAnsi="Arial"/>
           <w:color w:val="1E293B"/>
         </w:rPr>
-        <w:t xml:space="preserve"> : Pour chaque année d'exécution, la dépense brute de </w:t>
+        <w:t xml:space="preserve"> : Le budget annuel brut de </w:t>
       </w:r>
       <w:r>
         <w:rPr>
@@ -6267,14 +5801,28 @@
           <w:b/>
           <w:color w:val="0F172A"/>
         </w:rPr>
-        <w:t>435 000 €</w:t>
+        <w:t>435 000 € / an</w:t>
       </w:r>
       <w:r>
         <w:rPr>
           <w:rFonts w:ascii="Arial" w:hAnsi="Arial"/>
           <w:color w:val="1E293B"/>
         </w:rPr>
-        <w:t xml:space="preserve"> est co-financée à 50 % par l'UE, ne laissant que </w:t>
+        <w:t xml:space="preserve"> est réparti de manière transparente entre les 3 piliers d'action (Ville de Nice, Métropole Nice Côte d'Azur et Extension Monaco). Grâce au co-financement de 50 % de l'UE (</w:t>
+      </w:r>
+      <w:r>
+        <w:rPr>
+          <w:rFonts w:ascii="Arial" w:hAnsi="Arial"/>
+          <w:i/>
+        </w:rPr>
+        <w:t>Digital Europe</w:t>
+      </w:r>
+      <w:r>
+        <w:rPr>
+          <w:rFonts w:ascii="Arial" w:hAnsi="Arial"/>
+          <w:color w:val="1E293B"/>
+        </w:rPr>
+        <w:t xml:space="preserve">), le reste à charge métropolitain est de seulement </w:t>
       </w:r>
       <w:r>
         <w:rPr>
@@ -6282,14 +5830,14 @@
           <w:b/>
           <w:color w:val="0F172A"/>
         </w:rPr>
-        <w:t>217 500 € net</w:t>
+        <w:t>217 500 € / an</w:t>
       </w:r>
       <w:r>
         <w:rPr>
           <w:rFonts w:ascii="Arial" w:hAnsi="Arial"/>
           <w:color w:val="1E293B"/>
         </w:rPr>
-        <w:t xml:space="preserve"> à la Métropole, face à </w:t>
+        <w:t xml:space="preserve">, immédiatement compensé par </w:t>
       </w:r>
       <w:r>
         <w:rPr>
@@ -6297,22 +5845,7 @@
           <w:b/>
           <w:color w:val="0F172A"/>
         </w:rPr>
-        <w:t>+2 500 000 € d'économies certifiées</w:t>
-      </w:r>
-      <w:r>
-        <w:rPr>
-          <w:rFonts w:ascii="Arial" w:hAnsi="Arial"/>
-          <w:color w:val="1E293B"/>
-        </w:rPr>
-        <w:t xml:space="preserve">, dégageant un bénéfice net réinjecté dans le service public de </w:t>
-      </w:r>
-      <w:r>
-        <w:rPr>
-          <w:rFonts w:ascii="Arial" w:hAnsi="Arial"/>
-          <w:b/>
-          <w:color w:val="0F172A"/>
-        </w:rPr>
-        <w:t>+2 282 500 € par an</w:t>
+        <w:t>+2 500 000 € d'économies nettes certifiées</w:t>
       </w:r>
       <w:r>
         <w:rPr>
@@ -6329,23 +5862,22 @@
         <w:tblLook w:firstColumn="1" w:firstRow="1" w:lastColumn="0" w:lastRow="0" w:noHBand="0" w:noVBand="1" w:val="04A0"/>
       </w:tblPr>
       <w:tblGrid>
-        <w:gridCol w:w="1378"/>
-        <w:gridCol w:w="1378"/>
-        <w:gridCol w:w="1378"/>
-        <w:gridCol w:w="1378"/>
-        <w:gridCol w:w="1378"/>
-        <w:gridCol w:w="1378"/>
-        <w:gridCol w:w="1378"/>
+        <w:gridCol w:w="1632"/>
+        <w:gridCol w:w="1632"/>
+        <w:gridCol w:w="1632"/>
+        <w:gridCol w:w="1632"/>
+        <w:gridCol w:w="1632"/>
+        <w:gridCol w:w="1632"/>
       </w:tblGrid>
       <w:tr>
         <w:tc>
           <w:tcPr>
-            <w:tcW w:type="dxa" w:w="1378"/>
+            <w:tcW w:type="dxa" w:w="1632"/>
             <w:shd w:fill="1E293B"/>
           </w:tcPr>
           <w:p>
             <w:pPr>
-              <w:spacing w:before="60" w:after="60"/>
+              <w:spacing w:before="80" w:after="80"/>
             </w:pPr>
             <w:r>
               <w:rPr>
@@ -6354,18 +5886,18 @@
                 <w:color w:val="FFFFFF"/>
                 <w:sz w:val="16"/>
               </w:rPr>
-              <w:t>Année Budgétaire</w:t>
+              <w:t>Pôle Institutionnel / Domaine</w:t>
             </w:r>
           </w:p>
         </w:tc>
         <w:tc>
           <w:tcPr>
-            <w:tcW w:type="dxa" w:w="1378"/>
+            <w:tcW w:type="dxa" w:w="1632"/>
             <w:shd w:fill="1E293B"/>
           </w:tcPr>
           <w:p>
             <w:pPr>
-              <w:spacing w:before="60" w:after="60"/>
+              <w:spacing w:before="80" w:after="80"/>
             </w:pPr>
             <w:r>
               <w:rPr>
@@ -6374,18 +5906,18 @@
                 <w:color w:val="FFFFFF"/>
                 <w:sz w:val="16"/>
               </w:rPr>
-              <w:t>Période Précise de Réalisation</w:t>
+              <w:t>Actions &amp; Projets Clefs</w:t>
             </w:r>
           </w:p>
         </w:tc>
         <w:tc>
           <w:tcPr>
-            <w:tcW w:type="dxa" w:w="1378"/>
+            <w:tcW w:type="dxa" w:w="1632"/>
             <w:shd w:fill="1E293B"/>
           </w:tcPr>
           <w:p>
             <w:pPr>
-              <w:spacing w:before="60" w:after="60"/>
+              <w:spacing w:before="80" w:after="80"/>
             </w:pPr>
             <w:r>
               <w:rPr>
@@ -6394,18 +5926,18 @@
                 <w:color w:val="FFFFFF"/>
                 <w:sz w:val="16"/>
               </w:rPr>
-              <w:t>Budget Brut</w:t>
+              <w:t>Budget Brut Annuel</w:t>
             </w:r>
           </w:p>
         </w:tc>
         <w:tc>
           <w:tcPr>
-            <w:tcW w:type="dxa" w:w="1378"/>
+            <w:tcW w:type="dxa" w:w="1632"/>
             <w:shd w:fill="1E293B"/>
           </w:tcPr>
           <w:p>
             <w:pPr>
-              <w:spacing w:before="60" w:after="60"/>
+              <w:spacing w:before="80" w:after="80"/>
             </w:pPr>
             <w:r>
               <w:rPr>
@@ -6420,12 +5952,12 @@
         </w:tc>
         <w:tc>
           <w:tcPr>
-            <w:tcW w:type="dxa" w:w="1378"/>
+            <w:tcW w:type="dxa" w:w="1632"/>
             <w:shd w:fill="1E293B"/>
           </w:tcPr>
           <w:p>
             <w:pPr>
-              <w:spacing w:before="60" w:after="60"/>
+              <w:spacing w:before="80" w:after="80"/>
             </w:pPr>
             <w:r>
               <w:rPr>
@@ -6440,12 +5972,12 @@
         </w:tc>
         <w:tc>
           <w:tcPr>
-            <w:tcW w:type="dxa" w:w="1378"/>
+            <w:tcW w:type="dxa" w:w="1632"/>
             <w:shd w:fill="1E293B"/>
           </w:tcPr>
           <w:p>
             <w:pPr>
-              <w:spacing w:before="60" w:after="60"/>
+              <w:spacing w:before="80" w:after="80"/>
             </w:pPr>
             <w:r>
               <w:rPr>
@@ -6454,18 +5986,368 @@
                 <w:color w:val="FFFFFF"/>
                 <w:sz w:val="16"/>
               </w:rPr>
-              <w:t>Gains Certifiés</w:t>
+              <w:t>Gains Certifiés Net</w:t>
+            </w:r>
+          </w:p>
+        </w:tc>
+      </w:tr>
+      <w:tr>
+        <w:tc>
+          <w:tcPr>
+            <w:tcW w:type="dxa" w:w="1632"/>
+            <w:shd w:fill="F8FAFC"/>
+          </w:tcPr>
+          <w:p>
+            <w:pPr>
+              <w:spacing w:before="80" w:after="80"/>
+            </w:pPr>
+            <w:r>
+              <w:rPr>
+                <w:rFonts w:ascii="Arial" w:hAnsi="Arial"/>
+                <w:color w:val="1E293B"/>
+                <w:sz w:val="16"/>
+              </w:rPr>
+              <w:t>1. AXE MAIRIE (Ville de Nice)</w:t>
             </w:r>
           </w:p>
         </w:tc>
         <w:tc>
           <w:tcPr>
-            <w:tcW w:type="dxa" w:w="1378"/>
-            <w:shd w:fill="1E293B"/>
+            <w:tcW w:type="dxa" w:w="1632"/>
+            <w:shd w:fill="F8FAFC"/>
           </w:tcPr>
           <w:p>
             <w:pPr>
-              <w:spacing w:before="60" w:after="60"/>
+              <w:spacing w:before="80" w:after="80"/>
+            </w:pPr>
+            <w:r>
+              <w:rPr>
+                <w:rFonts w:ascii="Arial" w:hAnsi="Arial"/>
+                <w:color w:val="1E293B"/>
+                <w:sz w:val="16"/>
+              </w:rPr>
+              <w:t>CSU VSA, Allo Niçois 24/7, Propreté, Consultation Einstein, Pôle Citoyens</w:t>
+            </w:r>
+          </w:p>
+        </w:tc>
+        <w:tc>
+          <w:tcPr>
+            <w:tcW w:type="dxa" w:w="1632"/>
+            <w:shd w:fill="F8FAFC"/>
+          </w:tcPr>
+          <w:p>
+            <w:pPr>
+              <w:spacing w:before="80" w:after="80"/>
+            </w:pPr>
+            <w:r>
+              <w:rPr>
+                <w:rFonts w:ascii="Arial" w:hAnsi="Arial"/>
+                <w:color w:val="1E293B"/>
+                <w:sz w:val="16"/>
+              </w:rPr>
+              <w:t>155 000 €</w:t>
+            </w:r>
+          </w:p>
+        </w:tc>
+        <w:tc>
+          <w:tcPr>
+            <w:tcW w:type="dxa" w:w="1632"/>
+            <w:shd w:fill="F8FAFC"/>
+          </w:tcPr>
+          <w:p>
+            <w:pPr>
+              <w:spacing w:before="80" w:after="80"/>
+            </w:pPr>
+            <w:r>
+              <w:rPr>
+                <w:rFonts w:ascii="Arial" w:hAnsi="Arial"/>
+                <w:color w:val="1E293B"/>
+                <w:sz w:val="16"/>
+              </w:rPr>
+              <w:t>77 500 €</w:t>
+            </w:r>
+          </w:p>
+        </w:tc>
+        <w:tc>
+          <w:tcPr>
+            <w:tcW w:type="dxa" w:w="1632"/>
+            <w:shd w:fill="F8FAFC"/>
+          </w:tcPr>
+          <w:p>
+            <w:pPr>
+              <w:spacing w:before="80" w:after="80"/>
+            </w:pPr>
+            <w:r>
+              <w:rPr>
+                <w:rFonts w:ascii="Arial" w:hAnsi="Arial"/>
+                <w:color w:val="1E293B"/>
+                <w:sz w:val="16"/>
+              </w:rPr>
+              <w:t>77 500 €</w:t>
+            </w:r>
+          </w:p>
+        </w:tc>
+        <w:tc>
+          <w:tcPr>
+            <w:tcW w:type="dxa" w:w="1632"/>
+            <w:shd w:fill="F8FAFC"/>
+          </w:tcPr>
+          <w:p>
+            <w:pPr>
+              <w:spacing w:before="80" w:after="80"/>
+            </w:pPr>
+            <w:r>
+              <w:rPr>
+                <w:rFonts w:ascii="Arial" w:hAnsi="Arial"/>
+                <w:color w:val="1E293B"/>
+                <w:sz w:val="16"/>
+              </w:rPr>
+              <w:t>Incivilités -65%, Interventions &lt;6min</w:t>
+            </w:r>
+          </w:p>
+        </w:tc>
+      </w:tr>
+      <w:tr>
+        <w:tc>
+          <w:tcPr>
+            <w:tcW w:type="dxa" w:w="1632"/>
+            <w:shd w:fill="FFFFFF"/>
+          </w:tcPr>
+          <w:p>
+            <w:pPr>
+              <w:spacing w:before="80" w:after="80"/>
+            </w:pPr>
+            <w:r>
+              <w:rPr>
+                <w:rFonts w:ascii="Arial" w:hAnsi="Arial"/>
+                <w:color w:val="1E293B"/>
+                <w:sz w:val="16"/>
+              </w:rPr>
+              <w:t>2. AXE MÉTROPOLE (Nice Côte d'Azur)</w:t>
+            </w:r>
+          </w:p>
+        </w:tc>
+        <w:tc>
+          <w:tcPr>
+            <w:tcW w:type="dxa" w:w="1632"/>
+            <w:shd w:fill="FFFFFF"/>
+          </w:tcPr>
+          <w:p>
+            <w:pPr>
+              <w:spacing w:before="80" w:after="80"/>
+            </w:pPr>
+            <w:r>
+              <w:rPr>
+                <w:rFonts w:ascii="Arial" w:hAnsi="Arial"/>
+                <w:color w:val="1E293B"/>
+                <w:sz w:val="16"/>
+              </w:rPr>
+              <w:t>Audit Commande Publique (300M€), SOC Cyber NIS 2, Pôle PME/PMI &amp; AMO (2,5j/sem)</w:t>
+            </w:r>
+          </w:p>
+        </w:tc>
+        <w:tc>
+          <w:tcPr>
+            <w:tcW w:type="dxa" w:w="1632"/>
+            <w:shd w:fill="FFFFFF"/>
+          </w:tcPr>
+          <w:p>
+            <w:pPr>
+              <w:spacing w:before="80" w:after="80"/>
+            </w:pPr>
+            <w:r>
+              <w:rPr>
+                <w:rFonts w:ascii="Arial" w:hAnsi="Arial"/>
+                <w:color w:val="1E293B"/>
+                <w:sz w:val="16"/>
+              </w:rPr>
+              <w:t>160 000 €</w:t>
+            </w:r>
+          </w:p>
+        </w:tc>
+        <w:tc>
+          <w:tcPr>
+            <w:tcW w:type="dxa" w:w="1632"/>
+            <w:shd w:fill="FFFFFF"/>
+          </w:tcPr>
+          <w:p>
+            <w:pPr>
+              <w:spacing w:before="80" w:after="80"/>
+            </w:pPr>
+            <w:r>
+              <w:rPr>
+                <w:rFonts w:ascii="Arial" w:hAnsi="Arial"/>
+                <w:color w:val="1E293B"/>
+                <w:sz w:val="16"/>
+              </w:rPr>
+              <w:t>80 000 €</w:t>
+            </w:r>
+          </w:p>
+        </w:tc>
+        <w:tc>
+          <w:tcPr>
+            <w:tcW w:type="dxa" w:w="1632"/>
+            <w:shd w:fill="FFFFFF"/>
+          </w:tcPr>
+          <w:p>
+            <w:pPr>
+              <w:spacing w:before="80" w:after="80"/>
+            </w:pPr>
+            <w:r>
+              <w:rPr>
+                <w:rFonts w:ascii="Arial" w:hAnsi="Arial"/>
+                <w:color w:val="1E293B"/>
+                <w:sz w:val="16"/>
+              </w:rPr>
+              <w:t>80 000 €</w:t>
+            </w:r>
+          </w:p>
+        </w:tc>
+        <w:tc>
+          <w:tcPr>
+            <w:tcW w:type="dxa" w:w="1632"/>
+            <w:shd w:fill="FFFFFF"/>
+          </w:tcPr>
+          <w:p>
+            <w:pPr>
+              <w:spacing w:before="80" w:after="80"/>
+            </w:pPr>
+            <w:r>
+              <w:rPr>
+                <w:rFonts w:ascii="Arial" w:hAnsi="Arial"/>
+                <w:color w:val="1E293B"/>
+                <w:sz w:val="16"/>
+              </w:rPr>
+              <w:t>+2 500 000 € / an Net (Marchés)</w:t>
+            </w:r>
+          </w:p>
+        </w:tc>
+      </w:tr>
+      <w:tr>
+        <w:tc>
+          <w:tcPr>
+            <w:tcW w:type="dxa" w:w="1632"/>
+            <w:shd w:fill="F8FAFC"/>
+          </w:tcPr>
+          <w:p>
+            <w:pPr>
+              <w:spacing w:before="80" w:after="80"/>
+            </w:pPr>
+            <w:r>
+              <w:rPr>
+                <w:rFonts w:ascii="Arial" w:hAnsi="Arial"/>
+                <w:color w:val="1E293B"/>
+                <w:sz w:val="16"/>
+              </w:rPr>
+              <w:t>3. AXE MONACO (Alliance &amp; Extension)</w:t>
+            </w:r>
+          </w:p>
+        </w:tc>
+        <w:tc>
+          <w:tcPr>
+            <w:tcW w:type="dxa" w:w="1632"/>
+            <w:shd w:fill="F8FAFC"/>
+          </w:tcPr>
+          <w:p>
+            <w:pPr>
+              <w:spacing w:before="80" w:after="80"/>
+            </w:pPr>
+            <w:r>
+              <w:rPr>
+                <w:rFonts w:ascii="Arial" w:hAnsi="Arial"/>
+                <w:color w:val="1E293B"/>
+                <w:sz w:val="16"/>
+              </w:rPr>
+              <w:t>Fibre Monaco Cloud (AMSN), Zone Franche Numérique, Task-Force Gigafactory 500M€</w:t>
+            </w:r>
+          </w:p>
+        </w:tc>
+        <w:tc>
+          <w:tcPr>
+            <w:tcW w:type="dxa" w:w="1632"/>
+            <w:shd w:fill="F8FAFC"/>
+          </w:tcPr>
+          <w:p>
+            <w:pPr>
+              <w:spacing w:before="80" w:after="80"/>
+            </w:pPr>
+            <w:r>
+              <w:rPr>
+                <w:rFonts w:ascii="Arial" w:hAnsi="Arial"/>
+                <w:color w:val="1E293B"/>
+                <w:sz w:val="16"/>
+              </w:rPr>
+              <w:t>120 000 €</w:t>
+            </w:r>
+          </w:p>
+        </w:tc>
+        <w:tc>
+          <w:tcPr>
+            <w:tcW w:type="dxa" w:w="1632"/>
+            <w:shd w:fill="F8FAFC"/>
+          </w:tcPr>
+          <w:p>
+            <w:pPr>
+              <w:spacing w:before="80" w:after="80"/>
+            </w:pPr>
+            <w:r>
+              <w:rPr>
+                <w:rFonts w:ascii="Arial" w:hAnsi="Arial"/>
+                <w:color w:val="1E293B"/>
+                <w:sz w:val="16"/>
+              </w:rPr>
+              <w:t>60 000 €</w:t>
+            </w:r>
+          </w:p>
+        </w:tc>
+        <w:tc>
+          <w:tcPr>
+            <w:tcW w:type="dxa" w:w="1632"/>
+            <w:shd w:fill="F8FAFC"/>
+          </w:tcPr>
+          <w:p>
+            <w:pPr>
+              <w:spacing w:before="80" w:after="80"/>
+            </w:pPr>
+            <w:r>
+              <w:rPr>
+                <w:rFonts w:ascii="Arial" w:hAnsi="Arial"/>
+                <w:color w:val="1E293B"/>
+                <w:sz w:val="16"/>
+              </w:rPr>
+              <w:t>60 000 €</w:t>
+            </w:r>
+          </w:p>
+        </w:tc>
+        <w:tc>
+          <w:tcPr>
+            <w:tcW w:type="dxa" w:w="1632"/>
+            <w:shd w:fill="F8FAFC"/>
+          </w:tcPr>
+          <w:p>
+            <w:pPr>
+              <w:spacing w:before="80" w:after="80"/>
+            </w:pPr>
+            <w:r>
+              <w:rPr>
+                <w:rFonts w:ascii="Arial" w:hAnsi="Arial"/>
+                <w:color w:val="1E293B"/>
+                <w:sz w:val="16"/>
+              </w:rPr>
+              <w:t>1,5M€ à 2,8M€ IT + 8-12M€ CAPEX</w:t>
+            </w:r>
+          </w:p>
+        </w:tc>
+      </w:tr>
+      <w:tr>
+        <w:tc>
+          <w:tcPr>
+            <w:tcW w:type="dxa" w:w="1632"/>
+            <w:shd w:fill="0F172A"/>
+          </w:tcPr>
+          <w:p>
+            <w:pPr>
+              <w:spacing w:before="80" w:after="80"/>
             </w:pPr>
             <w:r>
               <w:rPr>
@@ -6474,63 +6356,44 @@
                 <w:color w:val="FFFFFF"/>
                 <w:sz w:val="16"/>
               </w:rPr>
-              <w:t>Bénéfice Net Métropole</w:t>
-            </w:r>
-          </w:p>
-        </w:tc>
-      </w:tr>
-      <w:tr>
-        <w:tc>
-          <w:tcPr>
-            <w:tcW w:type="dxa" w:w="1378"/>
-            <w:shd w:fill="F8FAFC"/>
-          </w:tcPr>
-          <w:p>
-            <w:pPr>
-              <w:spacing w:before="60" w:after="60"/>
-            </w:pPr>
-            <w:r>
-              <w:rPr>
-                <w:rFonts w:ascii="Arial" w:hAnsi="Arial"/>
-                <w:color w:val="1E293B"/>
-                <w:sz w:val="16"/>
-              </w:rPr>
-              <w:t>ANNÉE 1</w:t>
+              <w:t>TOTAL ANNUEL CONSOLIDÉ</w:t>
             </w:r>
           </w:p>
         </w:tc>
         <w:tc>
           <w:tcPr>
-            <w:tcW w:type="dxa" w:w="1378"/>
-            <w:shd w:fill="F8FAFC"/>
+            <w:tcW w:type="dxa" w:w="1632"/>
+            <w:shd w:fill="0F172A"/>
           </w:tcPr>
           <w:p>
             <w:pPr>
-              <w:spacing w:before="60" w:after="60"/>
+              <w:spacing w:before="80" w:after="80"/>
             </w:pPr>
             <w:r>
               <w:rPr>
                 <w:rFonts w:ascii="Arial" w:hAnsi="Arial"/>
-                <w:color w:val="1E293B"/>
+                <w:b/>
+                <w:color w:val="FFFFFF"/>
                 <w:sz w:val="16"/>
               </w:rPr>
-              <w:t>Septembre 2026 — Août 2027</w:t>
+              <w:t>Ensemble des 3 Piliers Institutionnels (2026-2029)</w:t>
             </w:r>
           </w:p>
         </w:tc>
         <w:tc>
           <w:tcPr>
-            <w:tcW w:type="dxa" w:w="1378"/>
-            <w:shd w:fill="F8FAFC"/>
+            <w:tcW w:type="dxa" w:w="1632"/>
+            <w:shd w:fill="0F172A"/>
           </w:tcPr>
           <w:p>
             <w:pPr>
-              <w:spacing w:before="60" w:after="60"/>
+              <w:spacing w:before="80" w:after="80"/>
             </w:pPr>
             <w:r>
               <w:rPr>
                 <w:rFonts w:ascii="Arial" w:hAnsi="Arial"/>
-                <w:color w:val="1E293B"/>
+                <w:b/>
+                <w:color w:val="FFFFFF"/>
                 <w:sz w:val="16"/>
               </w:rPr>
               <w:t>435 000 €</w:t>
@@ -6539,17 +6402,18 @@
         </w:tc>
         <w:tc>
           <w:tcPr>
-            <w:tcW w:type="dxa" w:w="1378"/>
-            <w:shd w:fill="F8FAFC"/>
+            <w:tcW w:type="dxa" w:w="1632"/>
+            <w:shd w:fill="0F172A"/>
           </w:tcPr>
           <w:p>
             <w:pPr>
-              <w:spacing w:before="60" w:after="60"/>
+              <w:spacing w:before="80" w:after="80"/>
             </w:pPr>
             <w:r>
               <w:rPr>
                 <w:rFonts w:ascii="Arial" w:hAnsi="Arial"/>
-                <w:color w:val="1E293B"/>
+                <w:b/>
+                <w:color w:val="FFFFFF"/>
                 <w:sz w:val="16"/>
               </w:rPr>
               <w:t>217 500 €</w:t>
@@ -6558,17 +6422,18 @@
         </w:tc>
         <w:tc>
           <w:tcPr>
-            <w:tcW w:type="dxa" w:w="1378"/>
-            <w:shd w:fill="F8FAFC"/>
+            <w:tcW w:type="dxa" w:w="1632"/>
+            <w:shd w:fill="0F172A"/>
           </w:tcPr>
           <w:p>
             <w:pPr>
-              <w:spacing w:before="60" w:after="60"/>
+              <w:spacing w:before="80" w:after="80"/>
             </w:pPr>
             <w:r>
               <w:rPr>
                 <w:rFonts w:ascii="Arial" w:hAnsi="Arial"/>
-                <w:color w:val="1E293B"/>
+                <w:b/>
+                <w:color w:val="FFFFFF"/>
                 <w:sz w:val="16"/>
               </w:rPr>
               <w:t>217 500 €</w:t>
@@ -6577,322 +6442,12 @@
         </w:tc>
         <w:tc>
           <w:tcPr>
-            <w:tcW w:type="dxa" w:w="1378"/>
-            <w:shd w:fill="F8FAFC"/>
-          </w:tcPr>
-          <w:p>
-            <w:pPr>
-              <w:spacing w:before="60" w:after="60"/>
-            </w:pPr>
-            <w:r>
-              <w:rPr>
-                <w:rFonts w:ascii="Arial" w:hAnsi="Arial"/>
-                <w:color w:val="1E293B"/>
-                <w:sz w:val="16"/>
-              </w:rPr>
-              <w:t>+2 500 000 €</w:t>
-            </w:r>
-          </w:p>
-        </w:tc>
-        <w:tc>
-          <w:tcPr>
-            <w:tcW w:type="dxa" w:w="1378"/>
-            <w:shd w:fill="F8FAFC"/>
-          </w:tcPr>
-          <w:p>
-            <w:pPr>
-              <w:spacing w:before="60" w:after="60"/>
-            </w:pPr>
-            <w:r>
-              <w:rPr>
-                <w:rFonts w:ascii="Arial" w:hAnsi="Arial"/>
-                <w:color w:val="1E293B"/>
-                <w:sz w:val="16"/>
-              </w:rPr>
-              <w:t>+2 282 500 €</w:t>
-            </w:r>
-          </w:p>
-        </w:tc>
-      </w:tr>
-      <w:tr>
-        <w:tc>
-          <w:tcPr>
-            <w:tcW w:type="dxa" w:w="1378"/>
-            <w:shd w:fill="FFFFFF"/>
-          </w:tcPr>
-          <w:p>
-            <w:pPr>
-              <w:spacing w:before="60" w:after="60"/>
-            </w:pPr>
-            <w:r>
-              <w:rPr>
-                <w:rFonts w:ascii="Arial" w:hAnsi="Arial"/>
-                <w:color w:val="1E293B"/>
-                <w:sz w:val="16"/>
-              </w:rPr>
-              <w:t>ANNÉE 2</w:t>
-            </w:r>
-          </w:p>
-        </w:tc>
-        <w:tc>
-          <w:tcPr>
-            <w:tcW w:type="dxa" w:w="1378"/>
-            <w:shd w:fill="FFFFFF"/>
-          </w:tcPr>
-          <w:p>
-            <w:pPr>
-              <w:spacing w:before="60" w:after="60"/>
-            </w:pPr>
-            <w:r>
-              <w:rPr>
-                <w:rFonts w:ascii="Arial" w:hAnsi="Arial"/>
-                <w:color w:val="1E293B"/>
-                <w:sz w:val="16"/>
-              </w:rPr>
-              <w:t>Septembre 2027 — Août 2028</w:t>
-            </w:r>
-          </w:p>
-        </w:tc>
-        <w:tc>
-          <w:tcPr>
-            <w:tcW w:type="dxa" w:w="1378"/>
-            <w:shd w:fill="FFFFFF"/>
-          </w:tcPr>
-          <w:p>
-            <w:pPr>
-              <w:spacing w:before="60" w:after="60"/>
-            </w:pPr>
-            <w:r>
-              <w:rPr>
-                <w:rFonts w:ascii="Arial" w:hAnsi="Arial"/>
-                <w:color w:val="1E293B"/>
-                <w:sz w:val="16"/>
-              </w:rPr>
-              <w:t>435 000 €</w:t>
-            </w:r>
-          </w:p>
-        </w:tc>
-        <w:tc>
-          <w:tcPr>
-            <w:tcW w:type="dxa" w:w="1378"/>
-            <w:shd w:fill="FFFFFF"/>
-          </w:tcPr>
-          <w:p>
-            <w:pPr>
-              <w:spacing w:before="60" w:after="60"/>
-            </w:pPr>
-            <w:r>
-              <w:rPr>
-                <w:rFonts w:ascii="Arial" w:hAnsi="Arial"/>
-                <w:color w:val="1E293B"/>
-                <w:sz w:val="16"/>
-              </w:rPr>
-              <w:t>217 500 €</w:t>
-            </w:r>
-          </w:p>
-        </w:tc>
-        <w:tc>
-          <w:tcPr>
-            <w:tcW w:type="dxa" w:w="1378"/>
-            <w:shd w:fill="FFFFFF"/>
-          </w:tcPr>
-          <w:p>
-            <w:pPr>
-              <w:spacing w:before="60" w:after="60"/>
-            </w:pPr>
-            <w:r>
-              <w:rPr>
-                <w:rFonts w:ascii="Arial" w:hAnsi="Arial"/>
-                <w:color w:val="1E293B"/>
-                <w:sz w:val="16"/>
-              </w:rPr>
-              <w:t>217 500 €</w:t>
-            </w:r>
-          </w:p>
-        </w:tc>
-        <w:tc>
-          <w:tcPr>
-            <w:tcW w:type="dxa" w:w="1378"/>
-            <w:shd w:fill="FFFFFF"/>
-          </w:tcPr>
-          <w:p>
-            <w:pPr>
-              <w:spacing w:before="60" w:after="60"/>
-            </w:pPr>
-            <w:r>
-              <w:rPr>
-                <w:rFonts w:ascii="Arial" w:hAnsi="Arial"/>
-                <w:color w:val="1E293B"/>
-                <w:sz w:val="16"/>
-              </w:rPr>
-              <w:t>+2 500 000 €</w:t>
-            </w:r>
-          </w:p>
-        </w:tc>
-        <w:tc>
-          <w:tcPr>
-            <w:tcW w:type="dxa" w:w="1378"/>
-            <w:shd w:fill="FFFFFF"/>
-          </w:tcPr>
-          <w:p>
-            <w:pPr>
-              <w:spacing w:before="60" w:after="60"/>
-            </w:pPr>
-            <w:r>
-              <w:rPr>
-                <w:rFonts w:ascii="Arial" w:hAnsi="Arial"/>
-                <w:color w:val="1E293B"/>
-                <w:sz w:val="16"/>
-              </w:rPr>
-              <w:t>+2 282 500 €</w:t>
-            </w:r>
-          </w:p>
-        </w:tc>
-      </w:tr>
-      <w:tr>
-        <w:tc>
-          <w:tcPr>
-            <w:tcW w:type="dxa" w:w="1378"/>
-            <w:shd w:fill="F8FAFC"/>
-          </w:tcPr>
-          <w:p>
-            <w:pPr>
-              <w:spacing w:before="60" w:after="60"/>
-            </w:pPr>
-            <w:r>
-              <w:rPr>
-                <w:rFonts w:ascii="Arial" w:hAnsi="Arial"/>
-                <w:color w:val="1E293B"/>
-                <w:sz w:val="16"/>
-              </w:rPr>
-              <w:t>ANNÉE 3</w:t>
-            </w:r>
-          </w:p>
-        </w:tc>
-        <w:tc>
-          <w:tcPr>
-            <w:tcW w:type="dxa" w:w="1378"/>
-            <w:shd w:fill="F8FAFC"/>
-          </w:tcPr>
-          <w:p>
-            <w:pPr>
-              <w:spacing w:before="60" w:after="60"/>
-            </w:pPr>
-            <w:r>
-              <w:rPr>
-                <w:rFonts w:ascii="Arial" w:hAnsi="Arial"/>
-                <w:color w:val="1E293B"/>
-                <w:sz w:val="16"/>
-              </w:rPr>
-              <w:t>Septembre 2028 — Août 2029</w:t>
-            </w:r>
-          </w:p>
-        </w:tc>
-        <w:tc>
-          <w:tcPr>
-            <w:tcW w:type="dxa" w:w="1378"/>
-            <w:shd w:fill="F8FAFC"/>
-          </w:tcPr>
-          <w:p>
-            <w:pPr>
-              <w:spacing w:before="60" w:after="60"/>
-            </w:pPr>
-            <w:r>
-              <w:rPr>
-                <w:rFonts w:ascii="Arial" w:hAnsi="Arial"/>
-                <w:color w:val="1E293B"/>
-                <w:sz w:val="16"/>
-              </w:rPr>
-              <w:t>435 000 €</w:t>
-            </w:r>
-          </w:p>
-        </w:tc>
-        <w:tc>
-          <w:tcPr>
-            <w:tcW w:type="dxa" w:w="1378"/>
-            <w:shd w:fill="F8FAFC"/>
-          </w:tcPr>
-          <w:p>
-            <w:pPr>
-              <w:spacing w:before="60" w:after="60"/>
-            </w:pPr>
-            <w:r>
-              <w:rPr>
-                <w:rFonts w:ascii="Arial" w:hAnsi="Arial"/>
-                <w:color w:val="1E293B"/>
-                <w:sz w:val="16"/>
-              </w:rPr>
-              <w:t>217 500 €</w:t>
-            </w:r>
-          </w:p>
-        </w:tc>
-        <w:tc>
-          <w:tcPr>
-            <w:tcW w:type="dxa" w:w="1378"/>
-            <w:shd w:fill="F8FAFC"/>
-          </w:tcPr>
-          <w:p>
-            <w:pPr>
-              <w:spacing w:before="60" w:after="60"/>
-            </w:pPr>
-            <w:r>
-              <w:rPr>
-                <w:rFonts w:ascii="Arial" w:hAnsi="Arial"/>
-                <w:color w:val="1E293B"/>
-                <w:sz w:val="16"/>
-              </w:rPr>
-              <w:t>217 500 €</w:t>
-            </w:r>
-          </w:p>
-        </w:tc>
-        <w:tc>
-          <w:tcPr>
-            <w:tcW w:type="dxa" w:w="1378"/>
-            <w:shd w:fill="F8FAFC"/>
-          </w:tcPr>
-          <w:p>
-            <w:pPr>
-              <w:spacing w:before="60" w:after="60"/>
-            </w:pPr>
-            <w:r>
-              <w:rPr>
-                <w:rFonts w:ascii="Arial" w:hAnsi="Arial"/>
-                <w:color w:val="1E293B"/>
-                <w:sz w:val="16"/>
-              </w:rPr>
-              <w:t>+2 500 000 €</w:t>
-            </w:r>
-          </w:p>
-        </w:tc>
-        <w:tc>
-          <w:tcPr>
-            <w:tcW w:type="dxa" w:w="1378"/>
-            <w:shd w:fill="F8FAFC"/>
-          </w:tcPr>
-          <w:p>
-            <w:pPr>
-              <w:spacing w:before="60" w:after="60"/>
-            </w:pPr>
-            <w:r>
-              <w:rPr>
-                <w:rFonts w:ascii="Arial" w:hAnsi="Arial"/>
-                <w:color w:val="1E293B"/>
-                <w:sz w:val="16"/>
-              </w:rPr>
-              <w:t>+2 282 500 €</w:t>
-            </w:r>
-          </w:p>
-        </w:tc>
-      </w:tr>
-      <w:tr>
-        <w:tc>
-          <w:tcPr>
-            <w:tcW w:type="dxa" w:w="1378"/>
+            <w:tcW w:type="dxa" w:w="1632"/>
             <w:shd w:fill="0F172A"/>
           </w:tcPr>
           <w:p>
             <w:pPr>
-              <w:spacing w:before="60" w:after="60"/>
+              <w:spacing w:before="80" w:after="80"/>
             </w:pPr>
             <w:r>
               <w:rPr>
@@ -6901,127 +6456,7 @@
                 <w:color w:val="FFFFFF"/>
                 <w:sz w:val="16"/>
               </w:rPr>
-              <w:t>TOTAL 3 ANS</w:t>
-            </w:r>
-          </w:p>
-        </w:tc>
-        <w:tc>
-          <w:tcPr>
-            <w:tcW w:type="dxa" w:w="1378"/>
-            <w:shd w:fill="0F172A"/>
-          </w:tcPr>
-          <w:p>
-            <w:pPr>
-              <w:spacing w:before="60" w:after="60"/>
-            </w:pPr>
-            <w:r>
-              <w:rPr>
-                <w:rFonts w:ascii="Arial" w:hAnsi="Arial"/>
-                <w:b/>
-                <w:color w:val="FFFFFF"/>
-                <w:sz w:val="16"/>
-              </w:rPr>
-              <w:t>1er Sept 2026 — 31 Août 2029</w:t>
-            </w:r>
-          </w:p>
-        </w:tc>
-        <w:tc>
-          <w:tcPr>
-            <w:tcW w:type="dxa" w:w="1378"/>
-            <w:shd w:fill="0F172A"/>
-          </w:tcPr>
-          <w:p>
-            <w:pPr>
-              <w:spacing w:before="60" w:after="60"/>
-            </w:pPr>
-            <w:r>
-              <w:rPr>
-                <w:rFonts w:ascii="Arial" w:hAnsi="Arial"/>
-                <w:b/>
-                <w:color w:val="FFFFFF"/>
-                <w:sz w:val="16"/>
-              </w:rPr>
-              <w:t>1 305 000 €</w:t>
-            </w:r>
-          </w:p>
-        </w:tc>
-        <w:tc>
-          <w:tcPr>
-            <w:tcW w:type="dxa" w:w="1378"/>
-            <w:shd w:fill="0F172A"/>
-          </w:tcPr>
-          <w:p>
-            <w:pPr>
-              <w:spacing w:before="60" w:after="60"/>
-            </w:pPr>
-            <w:r>
-              <w:rPr>
-                <w:rFonts w:ascii="Arial" w:hAnsi="Arial"/>
-                <w:b/>
-                <w:color w:val="FFFFFF"/>
-                <w:sz w:val="16"/>
-              </w:rPr>
-              <w:t>652 500 €</w:t>
-            </w:r>
-          </w:p>
-        </w:tc>
-        <w:tc>
-          <w:tcPr>
-            <w:tcW w:type="dxa" w:w="1378"/>
-            <w:shd w:fill="0F172A"/>
-          </w:tcPr>
-          <w:p>
-            <w:pPr>
-              <w:spacing w:before="60" w:after="60"/>
-            </w:pPr>
-            <w:r>
-              <w:rPr>
-                <w:rFonts w:ascii="Arial" w:hAnsi="Arial"/>
-                <w:b/>
-                <w:color w:val="FFFFFF"/>
-                <w:sz w:val="16"/>
-              </w:rPr>
-              <w:t>652 500 €</w:t>
-            </w:r>
-          </w:p>
-        </w:tc>
-        <w:tc>
-          <w:tcPr>
-            <w:tcW w:type="dxa" w:w="1378"/>
-            <w:shd w:fill="0F172A"/>
-          </w:tcPr>
-          <w:p>
-            <w:pPr>
-              <w:spacing w:before="60" w:after="60"/>
-            </w:pPr>
-            <w:r>
-              <w:rPr>
-                <w:rFonts w:ascii="Arial" w:hAnsi="Arial"/>
-                <w:b/>
-                <w:color w:val="FFFFFF"/>
-                <w:sz w:val="16"/>
-              </w:rPr>
-              <w:t>+7 500 000 €</w:t>
-            </w:r>
-          </w:p>
-        </w:tc>
-        <w:tc>
-          <w:tcPr>
-            <w:tcW w:type="dxa" w:w="1378"/>
-            <w:shd w:fill="0F172A"/>
-          </w:tcPr>
-          <w:p>
-            <w:pPr>
-              <w:spacing w:before="60" w:after="60"/>
-            </w:pPr>
-            <w:r>
-              <w:rPr>
-                <w:rFonts w:ascii="Arial" w:hAnsi="Arial"/>
-                <w:b/>
-                <w:color w:val="FFFFFF"/>
-                <w:sz w:val="16"/>
-              </w:rPr>
-              <w:t>+6 847 500 €</w:t>
+              <w:t>+2 500 000 € / an (Bénéfice +2,28 M€)</w:t>
             </w:r>
           </w:p>
         </w:tc>
@@ -7292,7 +6727,7 @@
     </w:p>
     <w:sectPr>
       <w:pgSz w:w="12240" w:h="15840"/>
-      <w:pgMar w:top="1296" w:right="1296" w:bottom="1296" w:left="1296" w:header="720" w:footer="720" w:gutter="0"/>
+      <w:pgMar w:top="1224" w:right="1224" w:bottom="1224" w:left="1224" w:header="720" w:footer="720" w:gutter="0"/>
       <w:cols w:space="720"/>
       <w:docGrid w:linePitch="360"/>
     </w:sectPr>

</xml_diff>